<commit_message>
Parent practice pack in A+D style (new builder), weekly PDFs rebuilt from the new workbook and guide, dollar questions in L6 bank, email pack update
Co-Authored-By: Claude Opus 5.5 <noreply@anthropic.com>
Claude-Session: https://claude.ai/code/session_01NYgB3ju57UwWRpkPPM6X7F
</commit_message>
<xml_diff>
--- a/outputs/designed/Math_Inquirers_P1_Question_Bank.docx
+++ b/outputs/designed/Math_Inquirers_P1_Question_Bank.docx
@@ -920,7 +920,7 @@
                 <w:sz w:val="22"/>
                 <w:szCs w:val="22"/>
               </w:rPr>
-              <w:t xml:space="preserve">6 + 6 + 8 questions</w:t>
+              <w:t xml:space="preserve">8 + 7 + 8 questions</w:t>
             </w:r>
           </w:p>
         </w:tc>
@@ -6266,6 +6266,72 @@
           <w:sz w:val="23"/>
           <w:szCs w:val="23"/>
         </w:rPr>
+        <w:t xml:space="preserve">Pay exactly $15 with the fewest notes. The notes are $2, $5, $10 and $50.</w:t>
+      </w:r>
+    </w:p>
+    <w:p>
+      <w:pPr>
+        <w:keepLines/>
+        <w:spacing w:after="60" w:before="60" w:line="290" w:lineRule="auto"/>
+        <w:ind w:left="640" w:hanging="640"/>
+      </w:pPr>
+      <w:r>
+        <w:rPr>
+          <w:rFonts w:ascii="Arial" w:cs="Arial" w:eastAsia="Arial" w:hAnsi="Arial"/>
+          <w:b/>
+          <w:bCs/>
+          <w:sz w:val="23"/>
+          <w:szCs w:val="23"/>
+        </w:rPr>
+        <w:t xml:space="preserve">C4.</w:t>
+      </w:r>
+      <w:r>
+        <w:rPr>
+          <w:rFonts w:ascii="Arial" w:cs="Arial" w:eastAsia="Arial" w:hAnsi="Arial"/>
+          <w:sz w:val="23"/>
+          <w:szCs w:val="23"/>
+        </w:rPr>
+        <w:tab/>
+      </w:r>
+      <w:r>
+        <w:rPr>
+          <w:rFonts w:ascii="Arial" w:cs="Arial" w:eastAsia="Arial" w:hAnsi="Arial"/>
+          <w:sz w:val="23"/>
+          <w:szCs w:val="23"/>
+        </w:rPr>
+        <w:t xml:space="preserve">Pay exactly $26 with the fewest notes and coins. You have $1 coins and $2, $5, $10 and $50 notes.</w:t>
+      </w:r>
+    </w:p>
+    <w:p>
+      <w:pPr>
+        <w:keepLines/>
+        <w:spacing w:after="60" w:before="60" w:line="290" w:lineRule="auto"/>
+        <w:ind w:left="640" w:hanging="640"/>
+      </w:pPr>
+      <w:r>
+        <w:rPr>
+          <w:rFonts w:ascii="Arial" w:cs="Arial" w:eastAsia="Arial" w:hAnsi="Arial"/>
+          <w:b/>
+          <w:bCs/>
+          <w:sz w:val="23"/>
+          <w:szCs w:val="23"/>
+        </w:rPr>
+        <w:t xml:space="preserve">C5.</w:t>
+      </w:r>
+      <w:r>
+        <w:rPr>
+          <w:rFonts w:ascii="Arial" w:cs="Arial" w:eastAsia="Arial" w:hAnsi="Arial"/>
+          <w:sz w:val="23"/>
+          <w:szCs w:val="23"/>
+        </w:rPr>
+        <w:tab/>
+      </w:r>
+      <w:r>
+        <w:rPr>
+          <w:rFonts w:ascii="Arial" w:cs="Arial" w:eastAsia="Arial" w:hAnsi="Arial"/>
+          <w:sz w:val="23"/>
+          <w:szCs w:val="23"/>
+        </w:rPr>
         <w:t xml:space="preserve">Pay exactly 30¢ using two coins from 5¢, 10¢, 20¢ and 50¢.</w:t>
       </w:r>
     </w:p>
@@ -6283,7 +6349,7 @@
           <w:sz w:val="23"/>
           <w:szCs w:val="23"/>
         </w:rPr>
-        <w:t xml:space="preserve">C4.</w:t>
+        <w:t xml:space="preserve">C6.</w:t>
       </w:r>
       <w:r>
         <w:rPr>
@@ -6316,7 +6382,7 @@
           <w:sz w:val="23"/>
           <w:szCs w:val="23"/>
         </w:rPr>
-        <w:t xml:space="preserve">C5.</w:t>
+        <w:t xml:space="preserve">C7.</w:t>
       </w:r>
       <w:r>
         <w:rPr>
@@ -6349,7 +6415,7 @@
           <w:sz w:val="23"/>
           <w:szCs w:val="23"/>
         </w:rPr>
-        <w:t xml:space="preserve">C6.</w:t>
+        <w:t xml:space="preserve">C8.</w:t>
       </w:r>
       <w:r>
         <w:rPr>
@@ -6568,6 +6634,39 @@
           <w:sz w:val="23"/>
           <w:szCs w:val="23"/>
         </w:rPr>
+        <w:t xml:space="preserve">A bag costs $34. Ali pays with a $50 note. How much change does he get?</w:t>
+      </w:r>
+    </w:p>
+    <w:p>
+      <w:pPr>
+        <w:keepLines/>
+        <w:spacing w:after="60" w:before="60" w:line="290" w:lineRule="auto"/>
+        <w:ind w:left="640" w:hanging="640"/>
+      </w:pPr>
+      <w:r>
+        <w:rPr>
+          <w:rFonts w:ascii="Arial" w:cs="Arial" w:eastAsia="Arial" w:hAnsi="Arial"/>
+          <w:b/>
+          <w:bCs/>
+          <w:sz w:val="23"/>
+          <w:szCs w:val="23"/>
+        </w:rPr>
+        <w:t xml:space="preserve">S5.</w:t>
+      </w:r>
+      <w:r>
+        <w:rPr>
+          <w:rFonts w:ascii="Arial" w:cs="Arial" w:eastAsia="Arial" w:hAnsi="Arial"/>
+          <w:sz w:val="23"/>
+          <w:szCs w:val="23"/>
+        </w:rPr>
+        <w:tab/>
+      </w:r>
+      <w:r>
+        <w:rPr>
+          <w:rFonts w:ascii="Arial" w:cs="Arial" w:eastAsia="Arial" w:hAnsi="Arial"/>
+          <w:sz w:val="23"/>
+          <w:szCs w:val="23"/>
+        </w:rPr>
         <w:t xml:space="preserve">What is the fewest number of coins to make 65¢ from 5¢, 10¢, 20¢ and 50¢?</w:t>
       </w:r>
     </w:p>
@@ -6585,7 +6684,7 @@
           <w:sz w:val="23"/>
           <w:szCs w:val="23"/>
         </w:rPr>
-        <w:t xml:space="preserve">S5.</w:t>
+        <w:t xml:space="preserve">S6.</w:t>
       </w:r>
       <w:r>
         <w:rPr>
@@ -6618,7 +6717,7 @@
           <w:sz w:val="23"/>
           <w:szCs w:val="23"/>
         </w:rPr>
-        <w:t xml:space="preserve">S6.</w:t>
+        <w:t xml:space="preserve">S7.</w:t>
       </w:r>
       <w:r>
         <w:rPr>
@@ -14290,6 +14389,72 @@
           <w:sz w:val="20"/>
           <w:szCs w:val="20"/>
         </w:rPr>
+        <w:t xml:space="preserve">$10 + $5 (2 notes)</w:t>
+      </w:r>
+    </w:p>
+    <w:p>
+      <w:pPr>
+        <w:keepLines/>
+        <w:spacing w:after="20" w:before="20" w:line="260" w:lineRule="auto"/>
+        <w:ind w:left="640" w:hanging="640"/>
+      </w:pPr>
+      <w:r>
+        <w:rPr>
+          <w:rFonts w:ascii="Arial" w:cs="Arial" w:eastAsia="Arial" w:hAnsi="Arial"/>
+          <w:b/>
+          <w:bCs/>
+          <w:sz w:val="20"/>
+          <w:szCs w:val="20"/>
+        </w:rPr>
+        <w:t xml:space="preserve">C4.</w:t>
+      </w:r>
+      <w:r>
+        <w:rPr>
+          <w:rFonts w:ascii="Arial" w:cs="Arial" w:eastAsia="Arial" w:hAnsi="Arial"/>
+          <w:sz w:val="20"/>
+          <w:szCs w:val="20"/>
+        </w:rPr>
+        <w:tab/>
+      </w:r>
+      <w:r>
+        <w:rPr>
+          <w:rFonts w:ascii="Arial" w:cs="Arial" w:eastAsia="Arial" w:hAnsi="Arial"/>
+          <w:sz w:val="20"/>
+          <w:szCs w:val="20"/>
+        </w:rPr>
+        <w:t xml:space="preserve">$10 + $10 + $5 + $1 (4 pieces)</w:t>
+      </w:r>
+    </w:p>
+    <w:p>
+      <w:pPr>
+        <w:keepLines/>
+        <w:spacing w:after="20" w:before="20" w:line="260" w:lineRule="auto"/>
+        <w:ind w:left="640" w:hanging="640"/>
+      </w:pPr>
+      <w:r>
+        <w:rPr>
+          <w:rFonts w:ascii="Arial" w:cs="Arial" w:eastAsia="Arial" w:hAnsi="Arial"/>
+          <w:b/>
+          <w:bCs/>
+          <w:sz w:val="20"/>
+          <w:szCs w:val="20"/>
+        </w:rPr>
+        <w:t xml:space="preserve">C5.</w:t>
+      </w:r>
+      <w:r>
+        <w:rPr>
+          <w:rFonts w:ascii="Arial" w:cs="Arial" w:eastAsia="Arial" w:hAnsi="Arial"/>
+          <w:sz w:val="20"/>
+          <w:szCs w:val="20"/>
+        </w:rPr>
+        <w:tab/>
+      </w:r>
+      <w:r>
+        <w:rPr>
+          <w:rFonts w:ascii="Arial" w:cs="Arial" w:eastAsia="Arial" w:hAnsi="Arial"/>
+          <w:sz w:val="20"/>
+          <w:szCs w:val="20"/>
+        </w:rPr>
         <w:t xml:space="preserve">10¢ + 20¢</w:t>
       </w:r>
     </w:p>
@@ -14307,7 +14472,7 @@
           <w:sz w:val="20"/>
           <w:szCs w:val="20"/>
         </w:rPr>
-        <w:t xml:space="preserve">C4.</w:t>
+        <w:t xml:space="preserve">C6.</w:t>
       </w:r>
       <w:r>
         <w:rPr>
@@ -14340,7 +14505,7 @@
           <w:sz w:val="20"/>
           <w:szCs w:val="20"/>
         </w:rPr>
-        <w:t xml:space="preserve">C5.</w:t>
+        <w:t xml:space="preserve">C7.</w:t>
       </w:r>
       <w:r>
         <w:rPr>
@@ -14373,7 +14538,7 @@
           <w:sz w:val="20"/>
           <w:szCs w:val="20"/>
         </w:rPr>
-        <w:t xml:space="preserve">C6.</w:t>
+        <w:t xml:space="preserve">C8.</w:t>
       </w:r>
       <w:r>
         <w:rPr>
@@ -14521,6 +14686,39 @@
           <w:sz w:val="20"/>
           <w:szCs w:val="20"/>
         </w:rPr>
+        <w:t xml:space="preserve">$16. Count on from $34: $36, $40, $50. That is $2 + $4 + $10 = $16.</w:t>
+      </w:r>
+    </w:p>
+    <w:p>
+      <w:pPr>
+        <w:keepLines/>
+        <w:spacing w:after="20" w:before="20" w:line="260" w:lineRule="auto"/>
+        <w:ind w:left="640" w:hanging="640"/>
+      </w:pPr>
+      <w:r>
+        <w:rPr>
+          <w:rFonts w:ascii="Arial" w:cs="Arial" w:eastAsia="Arial" w:hAnsi="Arial"/>
+          <w:b/>
+          <w:bCs/>
+          <w:sz w:val="20"/>
+          <w:szCs w:val="20"/>
+        </w:rPr>
+        <w:t xml:space="preserve">S5.</w:t>
+      </w:r>
+      <w:r>
+        <w:rPr>
+          <w:rFonts w:ascii="Arial" w:cs="Arial" w:eastAsia="Arial" w:hAnsi="Arial"/>
+          <w:sz w:val="20"/>
+          <w:szCs w:val="20"/>
+        </w:rPr>
+        <w:tab/>
+      </w:r>
+      <w:r>
+        <w:rPr>
+          <w:rFonts w:ascii="Arial" w:cs="Arial" w:eastAsia="Arial" w:hAnsi="Arial"/>
+          <w:sz w:val="20"/>
+          <w:szCs w:val="20"/>
+        </w:rPr>
         <w:t xml:space="preserve">3 coins (50¢ + 10¢ + 5¢)</w:t>
       </w:r>
     </w:p>
@@ -14538,7 +14736,7 @@
           <w:sz w:val="20"/>
           <w:szCs w:val="20"/>
         </w:rPr>
-        <w:t xml:space="preserve">S5.</w:t>
+        <w:t xml:space="preserve">S6.</w:t>
       </w:r>
       <w:r>
         <w:rPr>
@@ -14571,7 +14769,7 @@
           <w:sz w:val="20"/>
           <w:szCs w:val="20"/>
         </w:rPr>
-        <w:t xml:space="preserve">S6.</w:t>
+        <w:t xml:space="preserve">S7.</w:t>
       </w:r>
       <w:r>
         <w:rPr>

</xml_diff>

<commit_message>
Apply P1 audit fixes; rebuild P1 decks and printed set
Co-Authored-By: Claude Sonnet 5.5 <noreply@anthropic.com>
Claude-Session: https://claude.ai/code/session_01NYgB3ju57UwWRpkPPM6X7F
</commit_message>
<xml_diff>
--- a/outputs/designed/Math_Inquirers_P1_Question_Bank.docx
+++ b/outputs/designed/Math_Inquirers_P1_Question_Bank.docx
@@ -814,7 +814,7 @@
                 <w:sz w:val="22"/>
                 <w:szCs w:val="22"/>
               </w:rPr>
-              <w:t xml:space="preserve">6 + 6 + 9 questions</w:t>
+              <w:t xml:space="preserve">6 + 7 + 9 questions</w:t>
             </w:r>
           </w:p>
         </w:tc>
@@ -920,7 +920,7 @@
                 <w:sz w:val="22"/>
                 <w:szCs w:val="22"/>
               </w:rPr>
-              <w:t xml:space="preserve">8 + 7 + 8 questions</w:t>
+              <w:t xml:space="preserve">8 + 9 + 8 questions</w:t>
             </w:r>
           </w:p>
         </w:tc>
@@ -1026,7 +1026,7 @@
                 <w:sz w:val="22"/>
                 <w:szCs w:val="22"/>
               </w:rPr>
-              <w:t xml:space="preserve">6 + 7 + 9 questions</w:t>
+              <w:t xml:space="preserve">6 + 9 + 9 questions</w:t>
             </w:r>
           </w:p>
         </w:tc>
@@ -1238,7 +1238,7 @@
                 <w:sz w:val="22"/>
                 <w:szCs w:val="22"/>
               </w:rPr>
-              <w:t xml:space="preserve">5 + 5 + 8 questions</w:t>
+              <w:t xml:space="preserve">6 + 7 + 8 questions</w:t>
             </w:r>
           </w:p>
         </w:tc>
@@ -2240,7 +2240,7 @@
           <w:sz w:val="23"/>
           <w:szCs w:val="23"/>
         </w:rPr>
-        <w:t xml:space="preserve">A pattern adds the same number each time. Its 5th number is 20 and it starts at a whole number more than 0. How many different patterns can you make? List the first number and the rule for each.</w:t>
+        <w:t xml:space="preserve">A pattern adds a number bigger than 0 each time, its 5th number is 20, and it starts at a whole number bigger than 0. How many different patterns can you make? List the first number and the rule for each.</w:t>
       </w:r>
     </w:p>
     <w:p>
@@ -4224,7 +4224,7 @@
           <w:sz w:val="23"/>
           <w:szCs w:val="23"/>
         </w:rPr>
-        <w:t xml:space="preserve">24 children voted. Apple got 6 votes. Orange got twice as many as banana. How many votes did banana and orange get?</w:t>
+        <w:t xml:space="preserve">24 children voted. Apple got 6 votes. Orange got 6 more votes than banana. How many votes did banana and orange get?</w:t>
       </w:r>
     </w:p>
     <w:p>
@@ -4257,7 +4257,7 @@
           <w:sz w:val="23"/>
           <w:szCs w:val="23"/>
         </w:rPr>
-        <w:t xml:space="preserve">1 picture = 4 children. 40 children voted for three fruits. A has 3 pictures. B has 2 more pictures than A. How many children chose C?</w:t>
+        <w:t xml:space="preserve">1 picture = 2 children. 20 children voted for three fruits. A has 3 pictures. B has 2 more pictures than A. How many children chose C?</w:t>
       </w:r>
     </w:p>
     <w:p>
@@ -5018,7 +5018,7 @@
           <w:sz w:val="23"/>
           <w:szCs w:val="23"/>
         </w:rPr>
-        <w:t xml:space="preserve">Matchstick triangles in a row use 3, 5, 7 sticks. Ben has 25 sticks. How many triangles can he make? How many sticks are left over?</w:t>
+        <w:t xml:space="preserve">Triangles made of sticks in a row use 3, 5, 7 sticks. Ben has 25 sticks. How many triangles can he make? How many sticks are left over?</w:t>
       </w:r>
     </w:p>
     <w:p>
@@ -5543,6 +5543,138 @@
           <w:sz w:val="23"/>
           <w:szCs w:val="23"/>
         </w:rPr>
+        <w:t xml:space="preserve">Ben had some marbles. He gave 5 to Mei, then won 3. Now he has 12. How many did he start with?</w:t>
+      </w:r>
+    </w:p>
+    <w:p>
+      <w:pPr>
+        <w:keepLines/>
+        <w:spacing w:after="60" w:before="60" w:line="290" w:lineRule="auto"/>
+        <w:ind w:left="640" w:hanging="640"/>
+      </w:pPr>
+      <w:r>
+        <w:rPr>
+          <w:rFonts w:ascii="Arial" w:cs="Arial" w:eastAsia="Arial" w:hAnsi="Arial"/>
+          <w:b/>
+          <w:bCs/>
+          <w:sz w:val="23"/>
+          <w:szCs w:val="23"/>
+        </w:rPr>
+        <w:t xml:space="preserve">S2.</w:t>
+      </w:r>
+      <w:r>
+        <w:rPr>
+          <w:rFonts w:ascii="Arial" w:cs="Arial" w:eastAsia="Arial" w:hAnsi="Arial"/>
+          <w:sz w:val="23"/>
+          <w:szCs w:val="23"/>
+        </w:rPr>
+        <w:tab/>
+      </w:r>
+      <w:r>
+        <w:rPr>
+          <w:rFonts w:ascii="Arial" w:cs="Arial" w:eastAsia="Arial" w:hAnsi="Arial"/>
+          <w:sz w:val="23"/>
+          <w:szCs w:val="23"/>
+        </w:rPr>
+        <w:t xml:space="preserve">Ben had some stickers. He gave away 6, got 4, then gave away 3. Now he has 10. How many did he have at first?</w:t>
+      </w:r>
+    </w:p>
+    <w:p>
+      <w:pPr>
+        <w:keepLines/>
+        <w:spacing w:after="60" w:before="60" w:line="290" w:lineRule="auto"/>
+        <w:ind w:left="640" w:hanging="640"/>
+      </w:pPr>
+      <w:r>
+        <w:rPr>
+          <w:rFonts w:ascii="Arial" w:cs="Arial" w:eastAsia="Arial" w:hAnsi="Arial"/>
+          <w:b/>
+          <w:bCs/>
+          <w:sz w:val="23"/>
+          <w:szCs w:val="23"/>
+        </w:rPr>
+        <w:t xml:space="preserve">S3.</w:t>
+      </w:r>
+      <w:r>
+        <w:rPr>
+          <w:rFonts w:ascii="Arial" w:cs="Arial" w:eastAsia="Arial" w:hAnsi="Arial"/>
+          <w:sz w:val="23"/>
+          <w:szCs w:val="23"/>
+        </w:rPr>
+        <w:tab/>
+      </w:r>
+      <w:r>
+        <w:rPr>
+          <w:rFonts w:ascii="Arial" w:cs="Arial" w:eastAsia="Arial" w:hAnsi="Arial"/>
+          <w:sz w:val="23"/>
+          <w:szCs w:val="23"/>
+        </w:rPr>
+        <w:t xml:space="preserve">A number machine adds the same number each time. IN 4 gives OUT 9. What is the rule? What is OUT when IN is 12? What is IN when OUT is 20?</w:t>
+      </w:r>
+    </w:p>
+    <w:p>
+      <w:pPr>
+        <w:keepLines/>
+        <w:spacing w:after="60" w:before="60" w:line="290" w:lineRule="auto"/>
+        <w:ind w:left="640" w:hanging="640"/>
+      </w:pPr>
+      <w:r>
+        <w:rPr>
+          <w:rFonts w:ascii="Arial" w:cs="Arial" w:eastAsia="Arial" w:hAnsi="Arial"/>
+          <w:b/>
+          <w:bCs/>
+          <w:sz w:val="23"/>
+          <w:szCs w:val="23"/>
+        </w:rPr>
+        <w:t xml:space="preserve">S4.</w:t>
+      </w:r>
+      <w:r>
+        <w:rPr>
+          <w:rFonts w:ascii="Arial" w:cs="Arial" w:eastAsia="Arial" w:hAnsi="Arial"/>
+          <w:sz w:val="23"/>
+          <w:szCs w:val="23"/>
+        </w:rPr>
+        <w:tab/>
+      </w:r>
+      <w:r>
+        <w:rPr>
+          <w:rFonts w:ascii="Arial" w:cs="Arial" w:eastAsia="Arial" w:hAnsi="Arial"/>
+          <w:sz w:val="23"/>
+          <w:szCs w:val="23"/>
+        </w:rPr>
+        <w:t xml:space="preserve">I think of a number. I add 4, then I take away 7. I get 8. What is my number?</w:t>
+      </w:r>
+    </w:p>
+    <w:p>
+      <w:pPr>
+        <w:keepLines/>
+        <w:spacing w:after="60" w:before="60" w:line="290" w:lineRule="auto"/>
+        <w:ind w:left="640" w:hanging="640"/>
+      </w:pPr>
+      <w:r>
+        <w:rPr>
+          <w:rFonts w:ascii="Arial" w:cs="Arial" w:eastAsia="Arial" w:hAnsi="Arial"/>
+          <w:b/>
+          <w:bCs/>
+          <w:sz w:val="23"/>
+          <w:szCs w:val="23"/>
+        </w:rPr>
+        <w:t xml:space="preserve">S5.</w:t>
+      </w:r>
+      <w:r>
+        <w:rPr>
+          <w:rFonts w:ascii="Arial" w:cs="Arial" w:eastAsia="Arial" w:hAnsi="Arial"/>
+          <w:sz w:val="23"/>
+          <w:szCs w:val="23"/>
+        </w:rPr>
+        <w:tab/>
+      </w:r>
+      <w:r>
+        <w:rPr>
+          <w:rFonts w:ascii="Arial" w:cs="Arial" w:eastAsia="Arial" w:hAnsi="Arial"/>
+          <w:sz w:val="23"/>
+          <w:szCs w:val="23"/>
+        </w:rPr>
         <w:t xml:space="preserve">I think of a number. I add 5, then I take away 3. I get 9. What is my number?</w:t>
       </w:r>
     </w:p>
@@ -5560,7 +5692,7 @@
           <w:sz w:val="23"/>
           <w:szCs w:val="23"/>
         </w:rPr>
-        <w:t xml:space="preserve">S2.</w:t>
+        <w:t xml:space="preserve">S6.</w:t>
       </w:r>
       <w:r>
         <w:rPr>
@@ -5593,40 +5725,7 @@
           <w:sz w:val="23"/>
           <w:szCs w:val="23"/>
         </w:rPr>
-        <w:t xml:space="preserve">S3.</w:t>
-      </w:r>
-      <w:r>
-        <w:rPr>
-          <w:rFonts w:ascii="Arial" w:cs="Arial" w:eastAsia="Arial" w:hAnsi="Arial"/>
-          <w:sz w:val="23"/>
-          <w:szCs w:val="23"/>
-        </w:rPr>
-        <w:tab/>
-      </w:r>
-      <w:r>
-        <w:rPr>
-          <w:rFonts w:ascii="Arial" w:cs="Arial" w:eastAsia="Arial" w:hAnsi="Arial"/>
-          <w:sz w:val="23"/>
-          <w:szCs w:val="23"/>
-        </w:rPr>
-        <w:t xml:space="preserve">I think of a number. I add 4, then I take away 7. I get 8. What is my number?</w:t>
-      </w:r>
-    </w:p>
-    <w:p>
-      <w:pPr>
-        <w:keepLines/>
-        <w:spacing w:after="60" w:before="60" w:line="290" w:lineRule="auto"/>
-        <w:ind w:left="640" w:hanging="640"/>
-      </w:pPr>
-      <w:r>
-        <w:rPr>
-          <w:rFonts w:ascii="Arial" w:cs="Arial" w:eastAsia="Arial" w:hAnsi="Arial"/>
-          <w:b/>
-          <w:bCs/>
-          <w:sz w:val="23"/>
-          <w:szCs w:val="23"/>
-        </w:rPr>
-        <w:t xml:space="preserve">S4.</w:t>
+        <w:t xml:space="preserve">S7.</w:t>
       </w:r>
       <w:r>
         <w:rPr>
@@ -5643,72 +5742,6 @@
           <w:szCs w:val="23"/>
         </w:rPr>
         <w:t xml:space="preserve">I think of a number. I add 9, then I take away 4. I get 12. What is my number?</w:t>
-      </w:r>
-    </w:p>
-    <w:p>
-      <w:pPr>
-        <w:keepLines/>
-        <w:spacing w:after="60" w:before="60" w:line="290" w:lineRule="auto"/>
-        <w:ind w:left="640" w:hanging="640"/>
-      </w:pPr>
-      <w:r>
-        <w:rPr>
-          <w:rFonts w:ascii="Arial" w:cs="Arial" w:eastAsia="Arial" w:hAnsi="Arial"/>
-          <w:b/>
-          <w:bCs/>
-          <w:sz w:val="23"/>
-          <w:szCs w:val="23"/>
-        </w:rPr>
-        <w:t xml:space="preserve">S5.</w:t>
-      </w:r>
-      <w:r>
-        <w:rPr>
-          <w:rFonts w:ascii="Arial" w:cs="Arial" w:eastAsia="Arial" w:hAnsi="Arial"/>
-          <w:sz w:val="23"/>
-          <w:szCs w:val="23"/>
-        </w:rPr>
-        <w:tab/>
-      </w:r>
-      <w:r>
-        <w:rPr>
-          <w:rFonts w:ascii="Arial" w:cs="Arial" w:eastAsia="Arial" w:hAnsi="Arial"/>
-          <w:sz w:val="23"/>
-          <w:szCs w:val="23"/>
-        </w:rPr>
-        <w:t xml:space="preserve">A number machine adds the same number each time. IN 4 gives OUT 9. What is the rule? What is OUT when IN is 12? What is IN when OUT is 20?</w:t>
-      </w:r>
-    </w:p>
-    <w:p>
-      <w:pPr>
-        <w:keepLines/>
-        <w:spacing w:after="60" w:before="60" w:line="290" w:lineRule="auto"/>
-        <w:ind w:left="640" w:hanging="640"/>
-      </w:pPr>
-      <w:r>
-        <w:rPr>
-          <w:rFonts w:ascii="Arial" w:cs="Arial" w:eastAsia="Arial" w:hAnsi="Arial"/>
-          <w:b/>
-          <w:bCs/>
-          <w:sz w:val="23"/>
-          <w:szCs w:val="23"/>
-        </w:rPr>
-        <w:t xml:space="preserve">S6.</w:t>
-      </w:r>
-      <w:r>
-        <w:rPr>
-          <w:rFonts w:ascii="Arial" w:cs="Arial" w:eastAsia="Arial" w:hAnsi="Arial"/>
-          <w:sz w:val="23"/>
-          <w:szCs w:val="23"/>
-        </w:rPr>
-        <w:tab/>
-      </w:r>
-      <w:r>
-        <w:rPr>
-          <w:rFonts w:ascii="Arial" w:cs="Arial" w:eastAsia="Arial" w:hAnsi="Arial"/>
-          <w:sz w:val="23"/>
-          <w:szCs w:val="23"/>
-        </w:rPr>
-        <w:t xml:space="preserve">Ben had some marbles. He gave 5 to Mei, then won 3. Now he has 12. How many did he start with?</w:t>
       </w:r>
     </w:p>
     <w:p>
@@ -6043,7 +6076,7 @@
           <w:sz w:val="23"/>
           <w:szCs w:val="23"/>
         </w:rPr>
-        <w:t xml:space="preserve">Ali is 5 years older than Ben. In 3 years’ time their ages will add up to 25. How old is each now?</w:t>
+        <w:t xml:space="preserve">Ali and Ben have 20 marbles together. Ali has 4 more than Ben. How many marbles does each have?</w:t>
       </w:r>
     </w:p>
     <w:p>
@@ -6535,6 +6568,138 @@
           <w:sz w:val="23"/>
           <w:szCs w:val="23"/>
         </w:rPr>
+        <w:t xml:space="preserve">A bag costs $34. Ali pays with a $50 note. How much change does he get?</w:t>
+      </w:r>
+    </w:p>
+    <w:p>
+      <w:pPr>
+        <w:keepLines/>
+        <w:spacing w:after="60" w:before="60" w:line="290" w:lineRule="auto"/>
+        <w:ind w:left="640" w:hanging="640"/>
+      </w:pPr>
+      <w:r>
+        <w:rPr>
+          <w:rFonts w:ascii="Arial" w:cs="Arial" w:eastAsia="Arial" w:hAnsi="Arial"/>
+          <w:b/>
+          <w:bCs/>
+          <w:sz w:val="23"/>
+          <w:szCs w:val="23"/>
+        </w:rPr>
+        <w:t xml:space="preserve">S2.</w:t>
+      </w:r>
+      <w:r>
+        <w:rPr>
+          <w:rFonts w:ascii="Arial" w:cs="Arial" w:eastAsia="Arial" w:hAnsi="Arial"/>
+          <w:sz w:val="23"/>
+          <w:szCs w:val="23"/>
+        </w:rPr>
+        <w:tab/>
+      </w:r>
+      <w:r>
+        <w:rPr>
+          <w:rFonts w:ascii="Arial" w:cs="Arial" w:eastAsia="Arial" w:hAnsi="Arial"/>
+          <w:sz w:val="23"/>
+          <w:szCs w:val="23"/>
+        </w:rPr>
+        <w:t xml:space="preserve">Make 70¢ using exactly 4 coins from 5¢, 10¢, 20¢ and 50¢. Find every set.</w:t>
+      </w:r>
+    </w:p>
+    <w:p>
+      <w:pPr>
+        <w:keepLines/>
+        <w:spacing w:after="60" w:before="60" w:line="290" w:lineRule="auto"/>
+        <w:ind w:left="640" w:hanging="640"/>
+      </w:pPr>
+      <w:r>
+        <w:rPr>
+          <w:rFonts w:ascii="Arial" w:cs="Arial" w:eastAsia="Arial" w:hAnsi="Arial"/>
+          <w:b/>
+          <w:bCs/>
+          <w:sz w:val="23"/>
+          <w:szCs w:val="23"/>
+        </w:rPr>
+        <w:t xml:space="preserve">S3.</w:t>
+      </w:r>
+      <w:r>
+        <w:rPr>
+          <w:rFonts w:ascii="Arial" w:cs="Arial" w:eastAsia="Arial" w:hAnsi="Arial"/>
+          <w:sz w:val="23"/>
+          <w:szCs w:val="23"/>
+        </w:rPr>
+        <w:tab/>
+      </w:r>
+      <w:r>
+        <w:rPr>
+          <w:rFonts w:ascii="Arial" w:cs="Arial" w:eastAsia="Arial" w:hAnsi="Arial"/>
+          <w:sz w:val="23"/>
+          <w:szCs w:val="23"/>
+        </w:rPr>
+        <w:t xml:space="preserve">Sam has only 10¢ and 20¢ coins. He pays exactly 90¢ using 6 coins. How many of each coin does he use?</w:t>
+      </w:r>
+    </w:p>
+    <w:p>
+      <w:pPr>
+        <w:keepLines/>
+        <w:spacing w:after="60" w:before="60" w:line="290" w:lineRule="auto"/>
+        <w:ind w:left="640" w:hanging="640"/>
+      </w:pPr>
+      <w:r>
+        <w:rPr>
+          <w:rFonts w:ascii="Arial" w:cs="Arial" w:eastAsia="Arial" w:hAnsi="Arial"/>
+          <w:b/>
+          <w:bCs/>
+          <w:sz w:val="23"/>
+          <w:szCs w:val="23"/>
+        </w:rPr>
+        <w:t xml:space="preserve">S4.</w:t>
+      </w:r>
+      <w:r>
+        <w:rPr>
+          <w:rFonts w:ascii="Arial" w:cs="Arial" w:eastAsia="Arial" w:hAnsi="Arial"/>
+          <w:sz w:val="23"/>
+          <w:szCs w:val="23"/>
+        </w:rPr>
+        <w:tab/>
+      </w:r>
+      <w:r>
+        <w:rPr>
+          <w:rFonts w:ascii="Arial" w:cs="Arial" w:eastAsia="Arial" w:hAnsi="Arial"/>
+          <w:sz w:val="23"/>
+          <w:szCs w:val="23"/>
+        </w:rPr>
+        <w:t xml:space="preserve">What is the fewest number of coins to make 45¢?</w:t>
+      </w:r>
+    </w:p>
+    <w:p>
+      <w:pPr>
+        <w:keepLines/>
+        <w:spacing w:after="60" w:before="60" w:line="290" w:lineRule="auto"/>
+        <w:ind w:left="640" w:hanging="640"/>
+      </w:pPr>
+      <w:r>
+        <w:rPr>
+          <w:rFonts w:ascii="Arial" w:cs="Arial" w:eastAsia="Arial" w:hAnsi="Arial"/>
+          <w:b/>
+          <w:bCs/>
+          <w:sz w:val="23"/>
+          <w:szCs w:val="23"/>
+        </w:rPr>
+        <w:t xml:space="preserve">S5.</w:t>
+      </w:r>
+      <w:r>
+        <w:rPr>
+          <w:rFonts w:ascii="Arial" w:cs="Arial" w:eastAsia="Arial" w:hAnsi="Arial"/>
+          <w:sz w:val="23"/>
+          <w:szCs w:val="23"/>
+        </w:rPr>
+        <w:tab/>
+      </w:r>
+      <w:r>
+        <w:rPr>
+          <w:rFonts w:ascii="Arial" w:cs="Arial" w:eastAsia="Arial" w:hAnsi="Arial"/>
+          <w:sz w:val="23"/>
+          <w:szCs w:val="23"/>
+        </w:rPr>
         <w:t xml:space="preserve">How many ways can you make 25¢ using 20¢, 10¢ and 5¢ coins?</w:t>
       </w:r>
     </w:p>
@@ -6552,7 +6717,7 @@
           <w:sz w:val="23"/>
           <w:szCs w:val="23"/>
         </w:rPr>
-        <w:t xml:space="preserve">S2.</w:t>
+        <w:t xml:space="preserve">S6.</w:t>
       </w:r>
       <w:r>
         <w:rPr>
@@ -6585,7 +6750,7 @@
           <w:sz w:val="23"/>
           <w:szCs w:val="23"/>
         </w:rPr>
-        <w:t xml:space="preserve">S3.</w:t>
+        <w:t xml:space="preserve">S7.</w:t>
       </w:r>
       <w:r>
         <w:rPr>
@@ -6618,40 +6783,7 @@
           <w:sz w:val="23"/>
           <w:szCs w:val="23"/>
         </w:rPr>
-        <w:t xml:space="preserve">S4.</w:t>
-      </w:r>
-      <w:r>
-        <w:rPr>
-          <w:rFonts w:ascii="Arial" w:cs="Arial" w:eastAsia="Arial" w:hAnsi="Arial"/>
-          <w:sz w:val="23"/>
-          <w:szCs w:val="23"/>
-        </w:rPr>
-        <w:tab/>
-      </w:r>
-      <w:r>
-        <w:rPr>
-          <w:rFonts w:ascii="Arial" w:cs="Arial" w:eastAsia="Arial" w:hAnsi="Arial"/>
-          <w:sz w:val="23"/>
-          <w:szCs w:val="23"/>
-        </w:rPr>
-        <w:t xml:space="preserve">A bag costs $34. Ali pays with a $50 note. How much change does he get?</w:t>
-      </w:r>
-    </w:p>
-    <w:p>
-      <w:pPr>
-        <w:keepLines/>
-        <w:spacing w:after="60" w:before="60" w:line="290" w:lineRule="auto"/>
-        <w:ind w:left="640" w:hanging="640"/>
-      </w:pPr>
-      <w:r>
-        <w:rPr>
-          <w:rFonts w:ascii="Arial" w:cs="Arial" w:eastAsia="Arial" w:hAnsi="Arial"/>
-          <w:b/>
-          <w:bCs/>
-          <w:sz w:val="23"/>
-          <w:szCs w:val="23"/>
-        </w:rPr>
-        <w:t xml:space="preserve">S5.</w:t>
+        <w:t xml:space="preserve">S8.</w:t>
       </w:r>
       <w:r>
         <w:rPr>
@@ -6684,40 +6816,7 @@
           <w:sz w:val="23"/>
           <w:szCs w:val="23"/>
         </w:rPr>
-        <w:t xml:space="preserve">S6.</w:t>
-      </w:r>
-      <w:r>
-        <w:rPr>
-          <w:rFonts w:ascii="Arial" w:cs="Arial" w:eastAsia="Arial" w:hAnsi="Arial"/>
-          <w:sz w:val="23"/>
-          <w:szCs w:val="23"/>
-        </w:rPr>
-        <w:tab/>
-      </w:r>
-      <w:r>
-        <w:rPr>
-          <w:rFonts w:ascii="Arial" w:cs="Arial" w:eastAsia="Arial" w:hAnsi="Arial"/>
-          <w:sz w:val="23"/>
-          <w:szCs w:val="23"/>
-        </w:rPr>
-        <w:t xml:space="preserve">What is the fewest number of coins to make 45¢?</w:t>
-      </w:r>
-    </w:p>
-    <w:p>
-      <w:pPr>
-        <w:keepLines/>
-        <w:spacing w:after="60" w:before="60" w:line="290" w:lineRule="auto"/>
-        <w:ind w:left="640" w:hanging="640"/>
-      </w:pPr>
-      <w:r>
-        <w:rPr>
-          <w:rFonts w:ascii="Arial" w:cs="Arial" w:eastAsia="Arial" w:hAnsi="Arial"/>
-          <w:b/>
-          <w:bCs/>
-          <w:sz w:val="23"/>
-          <w:szCs w:val="23"/>
-        </w:rPr>
-        <w:t xml:space="preserve">S7.</w:t>
+        <w:t xml:space="preserve">S9.</w:t>
       </w:r>
       <w:r>
         <w:rPr>
@@ -6936,7 +7035,7 @@
           <w:sz w:val="23"/>
           <w:szCs w:val="23"/>
         </w:rPr>
-        <w:t xml:space="preserve">Which amounts from 5¢ to 50¢ cannot be made using only 20¢ and 10¢ coins?</w:t>
+        <w:t xml:space="preserve">Which amounts in 5¢ steps (5¢, 10¢, 15¢ … 50¢) cannot be made using only 20¢ and 10¢ coins?</w:t>
       </w:r>
     </w:p>
     <w:p>
@@ -7258,7 +7357,7 @@
           <w:sz w:val="23"/>
           <w:szCs w:val="23"/>
         </w:rPr>
-        <w:t xml:space="preserve">How many sides and corners does a pentagon have?</w:t>
+        <w:t xml:space="preserve">Here is a pentagon (a shape with 5 straight sides). How many corners does it have?</w:t>
       </w:r>
     </w:p>
     <w:p>
@@ -7291,7 +7390,7 @@
           <w:sz w:val="23"/>
           <w:szCs w:val="23"/>
         </w:rPr>
-        <w:t xml:space="preserve">How many sides and corners does a hexagon have?</w:t>
+        <w:t xml:space="preserve">Here is a hexagon (a shape with 6 straight sides). How many corners does it have?</w:t>
       </w:r>
     </w:p>
     <w:p>
@@ -7324,7 +7423,7 @@
           <w:sz w:val="23"/>
           <w:szCs w:val="23"/>
         </w:rPr>
-        <w:t xml:space="preserve">How many sides and corners does a octagon have?</w:t>
+        <w:t xml:space="preserve">Here is an octagon (a shape with 8 straight sides). How many corners does it have?</w:t>
       </w:r>
     </w:p>
     <w:p>
@@ -7461,7 +7560,7 @@
           <w:sz w:val="23"/>
           <w:szCs w:val="23"/>
         </w:rPr>
-        <w:t xml:space="preserve">I have 4 sides. All my sides are the same length. What shape am I?</w:t>
+        <w:t xml:space="preserve">Fold a square along a diagonal and cut. Which shapes do you get?</w:t>
       </w:r>
     </w:p>
     <w:p>
@@ -7494,6 +7593,138 @@
           <w:sz w:val="23"/>
           <w:szCs w:val="23"/>
         </w:rPr>
+        <w:t xml:space="preserve">Two same-size triangles can make a square. Can they also make a bigger triangle? Draw how.</w:t>
+      </w:r>
+    </w:p>
+    <w:p>
+      <w:pPr>
+        <w:keepLines/>
+        <w:spacing w:after="60" w:before="60" w:line="290" w:lineRule="auto"/>
+        <w:ind w:left="640" w:hanging="640"/>
+      </w:pPr>
+      <w:r>
+        <w:rPr>
+          <w:rFonts w:ascii="Arial" w:cs="Arial" w:eastAsia="Arial" w:hAnsi="Arial"/>
+          <w:b/>
+          <w:bCs/>
+          <w:sz w:val="23"/>
+          <w:szCs w:val="23"/>
+        </w:rPr>
+        <w:t xml:space="preserve">S3.</w:t>
+      </w:r>
+      <w:r>
+        <w:rPr>
+          <w:rFonts w:ascii="Arial" w:cs="Arial" w:eastAsia="Arial" w:hAnsi="Arial"/>
+          <w:sz w:val="23"/>
+          <w:szCs w:val="23"/>
+        </w:rPr>
+        <w:tab/>
+      </w:r>
+      <w:r>
+        <w:rPr>
+          <w:rFonts w:ascii="Arial" w:cs="Arial" w:eastAsia="Arial" w:hAnsi="Arial"/>
+          <w:sz w:val="23"/>
+          <w:szCs w:val="23"/>
+        </w:rPr>
+        <w:t xml:space="preserve">How many squares are in a grid 3 squares long and 2 squares high?</w:t>
+      </w:r>
+    </w:p>
+    <w:p>
+      <w:pPr>
+        <w:keepLines/>
+        <w:spacing w:after="60" w:before="60" w:line="290" w:lineRule="auto"/>
+        <w:ind w:left="640" w:hanging="640"/>
+      </w:pPr>
+      <w:r>
+        <w:rPr>
+          <w:rFonts w:ascii="Arial" w:cs="Arial" w:eastAsia="Arial" w:hAnsi="Arial"/>
+          <w:b/>
+          <w:bCs/>
+          <w:sz w:val="23"/>
+          <w:szCs w:val="23"/>
+        </w:rPr>
+        <w:t xml:space="preserve">S4.</w:t>
+      </w:r>
+      <w:r>
+        <w:rPr>
+          <w:rFonts w:ascii="Arial" w:cs="Arial" w:eastAsia="Arial" w:hAnsi="Arial"/>
+          <w:sz w:val="23"/>
+          <w:szCs w:val="23"/>
+        </w:rPr>
+        <w:tab/>
+      </w:r>
+      <w:r>
+        <w:rPr>
+          <w:rFonts w:ascii="Arial" w:cs="Arial" w:eastAsia="Arial" w:hAnsi="Arial"/>
+          <w:sz w:val="23"/>
+          <w:szCs w:val="23"/>
+        </w:rPr>
+        <w:t xml:space="preserve">Join 4 same-size squares, whole sides touching. How many different shapes can you make? (Turns and flips are the same shape.)</w:t>
+      </w:r>
+    </w:p>
+    <w:p>
+      <w:pPr>
+        <w:keepLines/>
+        <w:spacing w:after="60" w:before="60" w:line="290" w:lineRule="auto"/>
+        <w:ind w:left="640" w:hanging="640"/>
+      </w:pPr>
+      <w:r>
+        <w:rPr>
+          <w:rFonts w:ascii="Arial" w:cs="Arial" w:eastAsia="Arial" w:hAnsi="Arial"/>
+          <w:b/>
+          <w:bCs/>
+          <w:sz w:val="23"/>
+          <w:szCs w:val="23"/>
+        </w:rPr>
+        <w:t xml:space="preserve">S5.</w:t>
+      </w:r>
+      <w:r>
+        <w:rPr>
+          <w:rFonts w:ascii="Arial" w:cs="Arial" w:eastAsia="Arial" w:hAnsi="Arial"/>
+          <w:sz w:val="23"/>
+          <w:szCs w:val="23"/>
+        </w:rPr>
+        <w:tab/>
+      </w:r>
+      <w:r>
+        <w:rPr>
+          <w:rFonts w:ascii="Arial" w:cs="Arial" w:eastAsia="Arial" w:hAnsi="Arial"/>
+          <w:sz w:val="23"/>
+          <w:szCs w:val="23"/>
+        </w:rPr>
+        <w:t xml:space="preserve">I have 4 sides, all the same length, and 4 square corners. What shape am I?</w:t>
+      </w:r>
+    </w:p>
+    <w:p>
+      <w:pPr>
+        <w:keepLines/>
+        <w:spacing w:after="60" w:before="60" w:line="290" w:lineRule="auto"/>
+        <w:ind w:left="640" w:hanging="640"/>
+      </w:pPr>
+      <w:r>
+        <w:rPr>
+          <w:rFonts w:ascii="Arial" w:cs="Arial" w:eastAsia="Arial" w:hAnsi="Arial"/>
+          <w:b/>
+          <w:bCs/>
+          <w:sz w:val="23"/>
+          <w:szCs w:val="23"/>
+        </w:rPr>
+        <w:t xml:space="preserve">S6.</w:t>
+      </w:r>
+      <w:r>
+        <w:rPr>
+          <w:rFonts w:ascii="Arial" w:cs="Arial" w:eastAsia="Arial" w:hAnsi="Arial"/>
+          <w:sz w:val="23"/>
+          <w:szCs w:val="23"/>
+        </w:rPr>
+        <w:tab/>
+      </w:r>
+      <w:r>
+        <w:rPr>
+          <w:rFonts w:ascii="Arial" w:cs="Arial" w:eastAsia="Arial" w:hAnsi="Arial"/>
+          <w:sz w:val="23"/>
+          <w:szCs w:val="23"/>
+        </w:rPr>
         <w:t xml:space="preserve">How many sides do 3 triangles have altogether?</w:t>
       </w:r>
     </w:p>
@@ -7511,7 +7742,7 @@
           <w:sz w:val="23"/>
           <w:szCs w:val="23"/>
         </w:rPr>
-        <w:t xml:space="preserve">S3.</w:t>
+        <w:t xml:space="preserve">S7.</w:t>
       </w:r>
       <w:r>
         <w:rPr>
@@ -7544,7 +7775,7 @@
           <w:sz w:val="23"/>
           <w:szCs w:val="23"/>
         </w:rPr>
-        <w:t xml:space="preserve">S4.</w:t>
+        <w:t xml:space="preserve">S8.</w:t>
       </w:r>
       <w:r>
         <w:rPr>
@@ -7577,89 +7808,23 @@
           <w:sz w:val="23"/>
           <w:szCs w:val="23"/>
         </w:rPr>
-        <w:t xml:space="preserve">S5.</w:t>
-      </w:r>
-      <w:r>
-        <w:rPr>
-          <w:rFonts w:ascii="Arial" w:cs="Arial" w:eastAsia="Arial" w:hAnsi="Arial"/>
-          <w:sz w:val="23"/>
-          <w:szCs w:val="23"/>
-        </w:rPr>
-        <w:tab/>
-      </w:r>
-      <w:r>
-        <w:rPr>
-          <w:rFonts w:ascii="Arial" w:cs="Arial" w:eastAsia="Arial" w:hAnsi="Arial"/>
-          <w:sz w:val="23"/>
-          <w:szCs w:val="23"/>
-        </w:rPr>
-        <w:t xml:space="preserve">Fold a square along a diagonal and cut. Which shapes do you get?</w:t>
-      </w:r>
-    </w:p>
-    <w:p>
-      <w:pPr>
-        <w:keepLines/>
-        <w:spacing w:after="60" w:before="60" w:line="290" w:lineRule="auto"/>
-        <w:ind w:left="640" w:hanging="640"/>
-      </w:pPr>
-      <w:r>
-        <w:rPr>
-          <w:rFonts w:ascii="Arial" w:cs="Arial" w:eastAsia="Arial" w:hAnsi="Arial"/>
-          <w:b/>
-          <w:bCs/>
-          <w:sz w:val="23"/>
-          <w:szCs w:val="23"/>
-        </w:rPr>
-        <w:t xml:space="preserve">S6.</w:t>
-      </w:r>
-      <w:r>
-        <w:rPr>
-          <w:rFonts w:ascii="Arial" w:cs="Arial" w:eastAsia="Arial" w:hAnsi="Arial"/>
-          <w:sz w:val="23"/>
-          <w:szCs w:val="23"/>
-        </w:rPr>
-        <w:tab/>
-      </w:r>
-      <w:r>
-        <w:rPr>
-          <w:rFonts w:ascii="Arial" w:cs="Arial" w:eastAsia="Arial" w:hAnsi="Arial"/>
-          <w:sz w:val="23"/>
-          <w:szCs w:val="23"/>
-        </w:rPr>
-        <w:t xml:space="preserve">Two same-size triangles can make a square. Can they also make a bigger triangle? Draw how.</w:t>
-      </w:r>
-    </w:p>
-    <w:p>
-      <w:pPr>
-        <w:keepLines/>
-        <w:spacing w:after="60" w:before="60" w:line="290" w:lineRule="auto"/>
-        <w:ind w:left="640" w:hanging="640"/>
-      </w:pPr>
-      <w:r>
-        <w:rPr>
-          <w:rFonts w:ascii="Arial" w:cs="Arial" w:eastAsia="Arial" w:hAnsi="Arial"/>
-          <w:b/>
-          <w:bCs/>
-          <w:sz w:val="23"/>
-          <w:szCs w:val="23"/>
-        </w:rPr>
-        <w:t xml:space="preserve">S7.</w:t>
-      </w:r>
-      <w:r>
-        <w:rPr>
-          <w:rFonts w:ascii="Arial" w:cs="Arial" w:eastAsia="Arial" w:hAnsi="Arial"/>
-          <w:sz w:val="23"/>
-          <w:szCs w:val="23"/>
-        </w:rPr>
-        <w:tab/>
-      </w:r>
-      <w:r>
-        <w:rPr>
-          <w:rFonts w:ascii="Arial" w:cs="Arial" w:eastAsia="Arial" w:hAnsi="Arial"/>
-          <w:sz w:val="23"/>
-          <w:szCs w:val="23"/>
-        </w:rPr>
-        <w:t xml:space="preserve">Which shape has the same number of sides as a rectangle but is not a rectangle? Say why.</w:t>
+        <w:t xml:space="preserve">S9.</w:t>
+      </w:r>
+      <w:r>
+        <w:rPr>
+          <w:rFonts w:ascii="Arial" w:cs="Arial" w:eastAsia="Arial" w:hAnsi="Arial"/>
+          <w:sz w:val="23"/>
+          <w:szCs w:val="23"/>
+        </w:rPr>
+        <w:tab/>
+      </w:r>
+      <w:r>
+        <w:rPr>
+          <w:rFonts w:ascii="Arial" w:cs="Arial" w:eastAsia="Arial" w:hAnsi="Arial"/>
+          <w:sz w:val="23"/>
+          <w:szCs w:val="23"/>
+        </w:rPr>
+        <w:t xml:space="preserve">Draw a shape with 4 straight sides that is NOT a square. Is it a rectangle?</w:t>
       </w:r>
     </w:p>
     <w:p>
@@ -9110,7 +9275,7 @@
           <w:sz w:val="23"/>
           <w:szCs w:val="23"/>
         </w:rPr>
-        <w:t xml:space="preserve">Which is longer: 8 cubes or 8 paper clips? Why can we not tell?</w:t>
+        <w:t xml:space="preserve">A rope is 8 cubes long. A string is 8 paper clips long. Do we know which is longer? Why not?</w:t>
       </w:r>
     </w:p>
     <w:p>
@@ -9144,6 +9309,39 @@
           <w:szCs w:val="23"/>
         </w:rPr>
         <w:t xml:space="preserve">Put in order from shortest: 11 cubes, 7 cubes, 9 cubes, 12 cubes.</w:t>
+      </w:r>
+    </w:p>
+    <w:p>
+      <w:pPr>
+        <w:keepLines/>
+        <w:spacing w:after="60" w:before="60" w:line="290" w:lineRule="auto"/>
+        <w:ind w:left="640" w:hanging="640"/>
+      </w:pPr>
+      <w:r>
+        <w:rPr>
+          <w:rFonts w:ascii="Arial" w:cs="Arial" w:eastAsia="Arial" w:hAnsi="Arial"/>
+          <w:b/>
+          <w:bCs/>
+          <w:sz w:val="23"/>
+          <w:szCs w:val="23"/>
+        </w:rPr>
+        <w:t xml:space="preserve">C6.</w:t>
+      </w:r>
+      <w:r>
+        <w:rPr>
+          <w:rFonts w:ascii="Arial" w:cs="Arial" w:eastAsia="Arial" w:hAnsi="Arial"/>
+          <w:sz w:val="23"/>
+          <w:szCs w:val="23"/>
+        </w:rPr>
+        <w:tab/>
+      </w:r>
+      <w:r>
+        <w:rPr>
+          <w:rFonts w:ascii="Arial" w:cs="Arial" w:eastAsia="Arial" w:hAnsi="Arial"/>
+          <w:sz w:val="23"/>
+          <w:szCs w:val="23"/>
+        </w:rPr>
+        <w:t xml:space="preserve">A ribbon lies from the 2 cm mark to the 7 cm mark on a ruler. How long is it?</w:t>
       </w:r>
     </w:p>
     <w:p>
@@ -9247,6 +9445,138 @@
           <w:sz w:val="23"/>
           <w:szCs w:val="23"/>
         </w:rPr>
+        <w:t xml:space="preserve">A caterpillar is 9 cubes long. It grows 2 cubes each day. How long is it after 3 days?</w:t>
+      </w:r>
+    </w:p>
+    <w:p>
+      <w:pPr>
+        <w:keepLines/>
+        <w:spacing w:after="60" w:before="60" w:line="290" w:lineRule="auto"/>
+        <w:ind w:left="640" w:hanging="640"/>
+      </w:pPr>
+      <w:r>
+        <w:rPr>
+          <w:rFonts w:ascii="Arial" w:cs="Arial" w:eastAsia="Arial" w:hAnsi="Arial"/>
+          <w:b/>
+          <w:bCs/>
+          <w:sz w:val="23"/>
+          <w:szCs w:val="23"/>
+        </w:rPr>
+        <w:t xml:space="preserve">S2.</w:t>
+      </w:r>
+      <w:r>
+        <w:rPr>
+          <w:rFonts w:ascii="Arial" w:cs="Arial" w:eastAsia="Arial" w:hAnsi="Arial"/>
+          <w:sz w:val="23"/>
+          <w:szCs w:val="23"/>
+        </w:rPr>
+        <w:tab/>
+      </w:r>
+      <w:r>
+        <w:rPr>
+          <w:rFonts w:ascii="Arial" w:cs="Arial" w:eastAsia="Arial" w:hAnsi="Arial"/>
+          <w:sz w:val="23"/>
+          <w:szCs w:val="23"/>
+        </w:rPr>
+        <w:t xml:space="preserve">A string is 15 cubes long. A rope is 8 cubes longer. How long is the rope?</w:t>
+      </w:r>
+    </w:p>
+    <w:p>
+      <w:pPr>
+        <w:keepLines/>
+        <w:spacing w:after="60" w:before="60" w:line="290" w:lineRule="auto"/>
+        <w:ind w:left="640" w:hanging="640"/>
+      </w:pPr>
+      <w:r>
+        <w:rPr>
+          <w:rFonts w:ascii="Arial" w:cs="Arial" w:eastAsia="Arial" w:hAnsi="Arial"/>
+          <w:b/>
+          <w:bCs/>
+          <w:sz w:val="23"/>
+          <w:szCs w:val="23"/>
+        </w:rPr>
+        <w:t xml:space="preserve">S3.</w:t>
+      </w:r>
+      <w:r>
+        <w:rPr>
+          <w:rFonts w:ascii="Arial" w:cs="Arial" w:eastAsia="Arial" w:hAnsi="Arial"/>
+          <w:sz w:val="23"/>
+          <w:szCs w:val="23"/>
+        </w:rPr>
+        <w:tab/>
+      </w:r>
+      <w:r>
+        <w:rPr>
+          <w:rFonts w:ascii="Arial" w:cs="Arial" w:eastAsia="Arial" w:hAnsi="Arial"/>
+          <w:sz w:val="23"/>
+          <w:szCs w:val="23"/>
+        </w:rPr>
+        <w:t xml:space="preserve">A ribbon lies from the 3 cm mark to the 11 cm mark. How long is it?</w:t>
+      </w:r>
+    </w:p>
+    <w:p>
+      <w:pPr>
+        <w:keepLines/>
+        <w:spacing w:after="60" w:before="60" w:line="290" w:lineRule="auto"/>
+        <w:ind w:left="640" w:hanging="640"/>
+      </w:pPr>
+      <w:r>
+        <w:rPr>
+          <w:rFonts w:ascii="Arial" w:cs="Arial" w:eastAsia="Arial" w:hAnsi="Arial"/>
+          <w:b/>
+          <w:bCs/>
+          <w:sz w:val="23"/>
+          <w:szCs w:val="23"/>
+        </w:rPr>
+        <w:t xml:space="preserve">S4.</w:t>
+      </w:r>
+      <w:r>
+        <w:rPr>
+          <w:rFonts w:ascii="Arial" w:cs="Arial" w:eastAsia="Arial" w:hAnsi="Arial"/>
+          <w:sz w:val="23"/>
+          <w:szCs w:val="23"/>
+        </w:rPr>
+        <w:tab/>
+      </w:r>
+      <w:r>
+        <w:rPr>
+          <w:rFonts w:ascii="Arial" w:cs="Arial" w:eastAsia="Arial" w:hAnsi="Arial"/>
+          <w:sz w:val="23"/>
+          <w:szCs w:val="23"/>
+        </w:rPr>
+        <w:t xml:space="preserve">A pencil is 3 erasers long. A ruler is 2 pencils long. A desk is 4 rulers long. How many erasers long is the desk?</w:t>
+      </w:r>
+    </w:p>
+    <w:p>
+      <w:pPr>
+        <w:keepLines/>
+        <w:spacing w:after="60" w:before="60" w:line="290" w:lineRule="auto"/>
+        <w:ind w:left="640" w:hanging="640"/>
+      </w:pPr>
+      <w:r>
+        <w:rPr>
+          <w:rFonts w:ascii="Arial" w:cs="Arial" w:eastAsia="Arial" w:hAnsi="Arial"/>
+          <w:b/>
+          <w:bCs/>
+          <w:sz w:val="23"/>
+          <w:szCs w:val="23"/>
+        </w:rPr>
+        <w:t xml:space="preserve">S5.</w:t>
+      </w:r>
+      <w:r>
+        <w:rPr>
+          <w:rFonts w:ascii="Arial" w:cs="Arial" w:eastAsia="Arial" w:hAnsi="Arial"/>
+          <w:sz w:val="23"/>
+          <w:szCs w:val="23"/>
+        </w:rPr>
+        <w:tab/>
+      </w:r>
+      <w:r>
+        <w:rPr>
+          <w:rFonts w:ascii="Arial" w:cs="Arial" w:eastAsia="Arial" w:hAnsi="Arial"/>
+          <w:sz w:val="23"/>
+          <w:szCs w:val="23"/>
+        </w:rPr>
         <w:t xml:space="preserve">1 clip is as long as 3 cubes. A pen is 12 cubes long. How many clips long is the pen?</w:t>
       </w:r>
     </w:p>
@@ -9264,7 +9594,7 @@
           <w:sz w:val="23"/>
           <w:szCs w:val="23"/>
         </w:rPr>
-        <w:t xml:space="preserve">S2.</w:t>
+        <w:t xml:space="preserve">S6.</w:t>
       </w:r>
       <w:r>
         <w:rPr>
@@ -9297,7 +9627,7 @@
           <w:sz w:val="23"/>
           <w:szCs w:val="23"/>
         </w:rPr>
-        <w:t xml:space="preserve">S3.</w:t>
+        <w:t xml:space="preserve">S7.</w:t>
       </w:r>
       <w:r>
         <w:rPr>
@@ -9314,72 +9644,6 @@
           <w:szCs w:val="23"/>
         </w:rPr>
         <w:t xml:space="preserve">Ali’s desk is 6 spans long. Mei’s desk is 9 spans long, but they measured the same desk. Whose hand is bigger?</w:t>
-      </w:r>
-    </w:p>
-    <w:p>
-      <w:pPr>
-        <w:keepLines/>
-        <w:spacing w:after="60" w:before="60" w:line="290" w:lineRule="auto"/>
-        <w:ind w:left="640" w:hanging="640"/>
-      </w:pPr>
-      <w:r>
-        <w:rPr>
-          <w:rFonts w:ascii="Arial" w:cs="Arial" w:eastAsia="Arial" w:hAnsi="Arial"/>
-          <w:b/>
-          <w:bCs/>
-          <w:sz w:val="23"/>
-          <w:szCs w:val="23"/>
-        </w:rPr>
-        <w:t xml:space="preserve">S4.</w:t>
-      </w:r>
-      <w:r>
-        <w:rPr>
-          <w:rFonts w:ascii="Arial" w:cs="Arial" w:eastAsia="Arial" w:hAnsi="Arial"/>
-          <w:sz w:val="23"/>
-          <w:szCs w:val="23"/>
-        </w:rPr>
-        <w:tab/>
-      </w:r>
-      <w:r>
-        <w:rPr>
-          <w:rFonts w:ascii="Arial" w:cs="Arial" w:eastAsia="Arial" w:hAnsi="Arial"/>
-          <w:sz w:val="23"/>
-          <w:szCs w:val="23"/>
-        </w:rPr>
-        <w:t xml:space="preserve">A caterpillar is 9 cubes long. It grows 2 cubes each day. How long is it after 3 days?</w:t>
-      </w:r>
-    </w:p>
-    <w:p>
-      <w:pPr>
-        <w:keepLines/>
-        <w:spacing w:after="60" w:before="60" w:line="290" w:lineRule="auto"/>
-        <w:ind w:left="640" w:hanging="640"/>
-      </w:pPr>
-      <w:r>
-        <w:rPr>
-          <w:rFonts w:ascii="Arial" w:cs="Arial" w:eastAsia="Arial" w:hAnsi="Arial"/>
-          <w:b/>
-          <w:bCs/>
-          <w:sz w:val="23"/>
-          <w:szCs w:val="23"/>
-        </w:rPr>
-        <w:t xml:space="preserve">S5.</w:t>
-      </w:r>
-      <w:r>
-        <w:rPr>
-          <w:rFonts w:ascii="Arial" w:cs="Arial" w:eastAsia="Arial" w:hAnsi="Arial"/>
-          <w:sz w:val="23"/>
-          <w:szCs w:val="23"/>
-        </w:rPr>
-        <w:tab/>
-      </w:r>
-      <w:r>
-        <w:rPr>
-          <w:rFonts w:ascii="Arial" w:cs="Arial" w:eastAsia="Arial" w:hAnsi="Arial"/>
-          <w:sz w:val="23"/>
-          <w:szCs w:val="23"/>
-        </w:rPr>
-        <w:t xml:space="preserve">A string is 15 cubes long. A rope is 8 cubes longer. How long is the rope?</w:t>
       </w:r>
     </w:p>
     <w:p>
@@ -9648,7 +9912,7 @@
           <w:sz w:val="23"/>
           <w:szCs w:val="23"/>
         </w:rPr>
-        <w:t xml:space="preserve">A ruler is 12 cubes long. Ali measures a desk by laying the ruler end to end 4 times and then 5 more cubes. How long is the desk in cubes?</w:t>
+        <w:t xml:space="preserve">A stick is 12 cubes long. Ali measures a desk by laying the stick end to end 4 times and then 5 more cubes. How long is the desk in cubes?</w:t>
       </w:r>
     </w:p>
     <w:p>
@@ -12853,7 +13117,7 @@
           <w:sz w:val="20"/>
           <w:szCs w:val="20"/>
         </w:rPr>
-        <w:t xml:space="preserve">Banana 6 and orange 12.</w:t>
+        <w:t xml:space="preserve">Banana 6 and orange 12. (24 − 6 = 18 for banana and orange; take away the extra 6: 12, share: 6 each; give orange the 6 back.)</w:t>
       </w:r>
     </w:p>
     <w:p>
@@ -12886,7 +13150,7 @@
           <w:sz w:val="20"/>
           <w:szCs w:val="20"/>
         </w:rPr>
-        <w:t xml:space="preserve">8 children (10 pictures in all; A 3 + B 5 = 8, so C has 2 pictures).</w:t>
+        <w:t xml:space="preserve">4 children (20 ÷ 2 = 10 pictures in all, counting in 2s to 20; A 3 + B 5 = 8, so C has 2 pictures = 4 children).</w:t>
       </w:r>
     </w:p>
     <w:p>
@@ -13811,6 +14075,138 @@
           <w:sz w:val="20"/>
           <w:szCs w:val="20"/>
         </w:rPr>
+        <w:t xml:space="preserve">14 (12 − 3 + 5)</w:t>
+      </w:r>
+    </w:p>
+    <w:p>
+      <w:pPr>
+        <w:keepLines/>
+        <w:spacing w:after="20" w:before="20" w:line="260" w:lineRule="auto"/>
+        <w:ind w:left="640" w:hanging="640"/>
+      </w:pPr>
+      <w:r>
+        <w:rPr>
+          <w:rFonts w:ascii="Arial" w:cs="Arial" w:eastAsia="Arial" w:hAnsi="Arial"/>
+          <w:b/>
+          <w:bCs/>
+          <w:sz w:val="20"/>
+          <w:szCs w:val="20"/>
+        </w:rPr>
+        <w:t xml:space="preserve">S2.</w:t>
+      </w:r>
+      <w:r>
+        <w:rPr>
+          <w:rFonts w:ascii="Arial" w:cs="Arial" w:eastAsia="Arial" w:hAnsi="Arial"/>
+          <w:sz w:val="20"/>
+          <w:szCs w:val="20"/>
+        </w:rPr>
+        <w:tab/>
+      </w:r>
+      <w:r>
+        <w:rPr>
+          <w:rFonts w:ascii="Arial" w:cs="Arial" w:eastAsia="Arial" w:hAnsi="Arial"/>
+          <w:sz w:val="20"/>
+          <w:szCs w:val="20"/>
+        </w:rPr>
+        <w:t xml:space="preserve">15 (work backwards: 10 + 3 = 13, 13 − 4 = 9, 9 + 6 = 15; check 15 − 6 + 4 − 3 = 10)</w:t>
+      </w:r>
+    </w:p>
+    <w:p>
+      <w:pPr>
+        <w:keepLines/>
+        <w:spacing w:after="20" w:before="20" w:line="260" w:lineRule="auto"/>
+        <w:ind w:left="640" w:hanging="640"/>
+      </w:pPr>
+      <w:r>
+        <w:rPr>
+          <w:rFonts w:ascii="Arial" w:cs="Arial" w:eastAsia="Arial" w:hAnsi="Arial"/>
+          <w:b/>
+          <w:bCs/>
+          <w:sz w:val="20"/>
+          <w:szCs w:val="20"/>
+        </w:rPr>
+        <w:t xml:space="preserve">S3.</w:t>
+      </w:r>
+      <w:r>
+        <w:rPr>
+          <w:rFonts w:ascii="Arial" w:cs="Arial" w:eastAsia="Arial" w:hAnsi="Arial"/>
+          <w:sz w:val="20"/>
+          <w:szCs w:val="20"/>
+        </w:rPr>
+        <w:tab/>
+      </w:r>
+      <w:r>
+        <w:rPr>
+          <w:rFonts w:ascii="Arial" w:cs="Arial" w:eastAsia="Arial" w:hAnsi="Arial"/>
+          <w:sz w:val="20"/>
+          <w:szCs w:val="20"/>
+        </w:rPr>
+        <w:t xml:space="preserve">Add 5. OUT is 17 when IN is 12. IN is 15 when OUT is 20.</w:t>
+      </w:r>
+    </w:p>
+    <w:p>
+      <w:pPr>
+        <w:keepLines/>
+        <w:spacing w:after="20" w:before="20" w:line="260" w:lineRule="auto"/>
+        <w:ind w:left="640" w:hanging="640"/>
+      </w:pPr>
+      <w:r>
+        <w:rPr>
+          <w:rFonts w:ascii="Arial" w:cs="Arial" w:eastAsia="Arial" w:hAnsi="Arial"/>
+          <w:b/>
+          <w:bCs/>
+          <w:sz w:val="20"/>
+          <w:szCs w:val="20"/>
+        </w:rPr>
+        <w:t xml:space="preserve">S4.</w:t>
+      </w:r>
+      <w:r>
+        <w:rPr>
+          <w:rFonts w:ascii="Arial" w:cs="Arial" w:eastAsia="Arial" w:hAnsi="Arial"/>
+          <w:sz w:val="20"/>
+          <w:szCs w:val="20"/>
+        </w:rPr>
+        <w:tab/>
+      </w:r>
+      <w:r>
+        <w:rPr>
+          <w:rFonts w:ascii="Arial" w:cs="Arial" w:eastAsia="Arial" w:hAnsi="Arial"/>
+          <w:sz w:val="20"/>
+          <w:szCs w:val="20"/>
+        </w:rPr>
+        <w:t xml:space="preserve">11</w:t>
+      </w:r>
+    </w:p>
+    <w:p>
+      <w:pPr>
+        <w:keepLines/>
+        <w:spacing w:after="20" w:before="20" w:line="260" w:lineRule="auto"/>
+        <w:ind w:left="640" w:hanging="640"/>
+      </w:pPr>
+      <w:r>
+        <w:rPr>
+          <w:rFonts w:ascii="Arial" w:cs="Arial" w:eastAsia="Arial" w:hAnsi="Arial"/>
+          <w:b/>
+          <w:bCs/>
+          <w:sz w:val="20"/>
+          <w:szCs w:val="20"/>
+        </w:rPr>
+        <w:t xml:space="preserve">S5.</w:t>
+      </w:r>
+      <w:r>
+        <w:rPr>
+          <w:rFonts w:ascii="Arial" w:cs="Arial" w:eastAsia="Arial" w:hAnsi="Arial"/>
+          <w:sz w:val="20"/>
+          <w:szCs w:val="20"/>
+        </w:rPr>
+        <w:tab/>
+      </w:r>
+      <w:r>
+        <w:rPr>
+          <w:rFonts w:ascii="Arial" w:cs="Arial" w:eastAsia="Arial" w:hAnsi="Arial"/>
+          <w:sz w:val="20"/>
+          <w:szCs w:val="20"/>
+        </w:rPr>
         <w:t xml:space="preserve">7</w:t>
       </w:r>
     </w:p>
@@ -13828,7 +14224,7 @@
           <w:sz w:val="20"/>
           <w:szCs w:val="20"/>
         </w:rPr>
-        <w:t xml:space="preserve">S2.</w:t>
+        <w:t xml:space="preserve">S6.</w:t>
       </w:r>
       <w:r>
         <w:rPr>
@@ -13861,7 +14257,106 @@
           <w:sz w:val="20"/>
           <w:szCs w:val="20"/>
         </w:rPr>
-        <w:t xml:space="preserve">S3.</w:t>
+        <w:t xml:space="preserve">S7.</w:t>
+      </w:r>
+      <w:r>
+        <w:rPr>
+          <w:rFonts w:ascii="Arial" w:cs="Arial" w:eastAsia="Arial" w:hAnsi="Arial"/>
+          <w:sz w:val="20"/>
+          <w:szCs w:val="20"/>
+        </w:rPr>
+        <w:tab/>
+      </w:r>
+      <w:r>
+        <w:rPr>
+          <w:rFonts w:ascii="Arial" w:cs="Arial" w:eastAsia="Arial" w:hAnsi="Arial"/>
+          <w:sz w:val="20"/>
+          <w:szCs w:val="20"/>
+        </w:rPr>
+        <w:t xml:space="preserve">7</w:t>
+      </w:r>
+    </w:p>
+    <w:p>
+      <w:pPr>
+        <w:keepLines/>
+        <w:spacing w:after="20" w:before="20" w:line="260" w:lineRule="auto"/>
+        <w:ind w:left="640" w:hanging="640"/>
+      </w:pPr>
+      <w:r>
+        <w:rPr>
+          <w:rFonts w:ascii="Arial" w:cs="Arial" w:eastAsia="Arial" w:hAnsi="Arial"/>
+          <w:b/>
+          <w:bCs/>
+          <w:sz w:val="20"/>
+          <w:szCs w:val="20"/>
+        </w:rPr>
+        <w:t xml:space="preserve">G1.</w:t>
+      </w:r>
+      <w:r>
+        <w:rPr>
+          <w:rFonts w:ascii="Arial" w:cs="Arial" w:eastAsia="Arial" w:hAnsi="Arial"/>
+          <w:sz w:val="20"/>
+          <w:szCs w:val="20"/>
+        </w:rPr>
+        <w:tab/>
+      </w:r>
+      <w:r>
+        <w:rPr>
+          <w:rFonts w:ascii="Arial" w:cs="Arial" w:eastAsia="Arial" w:hAnsi="Arial"/>
+          <w:sz w:val="20"/>
+          <w:szCs w:val="20"/>
+        </w:rPr>
+        <w:t xml:space="preserve">10 (17 − 5 + 4 − 6)</w:t>
+      </w:r>
+    </w:p>
+    <w:p>
+      <w:pPr>
+        <w:keepLines/>
+        <w:spacing w:after="20" w:before="20" w:line="260" w:lineRule="auto"/>
+        <w:ind w:left="640" w:hanging="640"/>
+      </w:pPr>
+      <w:r>
+        <w:rPr>
+          <w:rFonts w:ascii="Arial" w:cs="Arial" w:eastAsia="Arial" w:hAnsi="Arial"/>
+          <w:b/>
+          <w:bCs/>
+          <w:sz w:val="20"/>
+          <w:szCs w:val="20"/>
+        </w:rPr>
+        <w:t xml:space="preserve">G2.</w:t>
+      </w:r>
+      <w:r>
+        <w:rPr>
+          <w:rFonts w:ascii="Arial" w:cs="Arial" w:eastAsia="Arial" w:hAnsi="Arial"/>
+          <w:sz w:val="20"/>
+          <w:szCs w:val="20"/>
+        </w:rPr>
+        <w:tab/>
+      </w:r>
+      <w:r>
+        <w:rPr>
+          <w:rFonts w:ascii="Arial" w:cs="Arial" w:eastAsia="Arial" w:hAnsi="Arial"/>
+          <w:sz w:val="20"/>
+          <w:szCs w:val="20"/>
+        </w:rPr>
+        <w:t xml:space="preserve">13 (the same as adding 7)</w:t>
+      </w:r>
+    </w:p>
+    <w:p>
+      <w:pPr>
+        <w:keepLines/>
+        <w:spacing w:after="20" w:before="20" w:line="260" w:lineRule="auto"/>
+        <w:ind w:left="640" w:hanging="640"/>
+      </w:pPr>
+      <w:r>
+        <w:rPr>
+          <w:rFonts w:ascii="Arial" w:cs="Arial" w:eastAsia="Arial" w:hAnsi="Arial"/>
+          <w:b/>
+          <w:bCs/>
+          <w:sz w:val="20"/>
+          <w:szCs w:val="20"/>
+        </w:rPr>
+        <w:t xml:space="preserve">G3.</w:t>
       </w:r>
       <w:r>
         <w:rPr>
@@ -13894,7 +14389,7 @@
           <w:sz w:val="20"/>
           <w:szCs w:val="20"/>
         </w:rPr>
-        <w:t xml:space="preserve">S4.</w:t>
+        <w:t xml:space="preserve">G4.</w:t>
       </w:r>
       <w:r>
         <w:rPr>
@@ -13927,204 +14422,6 @@
           <w:sz w:val="20"/>
           <w:szCs w:val="20"/>
         </w:rPr>
-        <w:t xml:space="preserve">S5.</w:t>
-      </w:r>
-      <w:r>
-        <w:rPr>
-          <w:rFonts w:ascii="Arial" w:cs="Arial" w:eastAsia="Arial" w:hAnsi="Arial"/>
-          <w:sz w:val="20"/>
-          <w:szCs w:val="20"/>
-        </w:rPr>
-        <w:tab/>
-      </w:r>
-      <w:r>
-        <w:rPr>
-          <w:rFonts w:ascii="Arial" w:cs="Arial" w:eastAsia="Arial" w:hAnsi="Arial"/>
-          <w:sz w:val="20"/>
-          <w:szCs w:val="20"/>
-        </w:rPr>
-        <w:t xml:space="preserve">Add 5. OUT is 17 when IN is 12. IN is 15 when OUT is 20.</w:t>
-      </w:r>
-    </w:p>
-    <w:p>
-      <w:pPr>
-        <w:keepLines/>
-        <w:spacing w:after="20" w:before="20" w:line="260" w:lineRule="auto"/>
-        <w:ind w:left="640" w:hanging="640"/>
-      </w:pPr>
-      <w:r>
-        <w:rPr>
-          <w:rFonts w:ascii="Arial" w:cs="Arial" w:eastAsia="Arial" w:hAnsi="Arial"/>
-          <w:b/>
-          <w:bCs/>
-          <w:sz w:val="20"/>
-          <w:szCs w:val="20"/>
-        </w:rPr>
-        <w:t xml:space="preserve">S6.</w:t>
-      </w:r>
-      <w:r>
-        <w:rPr>
-          <w:rFonts w:ascii="Arial" w:cs="Arial" w:eastAsia="Arial" w:hAnsi="Arial"/>
-          <w:sz w:val="20"/>
-          <w:szCs w:val="20"/>
-        </w:rPr>
-        <w:tab/>
-      </w:r>
-      <w:r>
-        <w:rPr>
-          <w:rFonts w:ascii="Arial" w:cs="Arial" w:eastAsia="Arial" w:hAnsi="Arial"/>
-          <w:sz w:val="20"/>
-          <w:szCs w:val="20"/>
-        </w:rPr>
-        <w:t xml:space="preserve">14 (12 − 3 + 5)</w:t>
-      </w:r>
-    </w:p>
-    <w:p>
-      <w:pPr>
-        <w:keepLines/>
-        <w:spacing w:after="20" w:before="20" w:line="260" w:lineRule="auto"/>
-        <w:ind w:left="640" w:hanging="640"/>
-      </w:pPr>
-      <w:r>
-        <w:rPr>
-          <w:rFonts w:ascii="Arial" w:cs="Arial" w:eastAsia="Arial" w:hAnsi="Arial"/>
-          <w:b/>
-          <w:bCs/>
-          <w:sz w:val="20"/>
-          <w:szCs w:val="20"/>
-        </w:rPr>
-        <w:t xml:space="preserve">G1.</w:t>
-      </w:r>
-      <w:r>
-        <w:rPr>
-          <w:rFonts w:ascii="Arial" w:cs="Arial" w:eastAsia="Arial" w:hAnsi="Arial"/>
-          <w:sz w:val="20"/>
-          <w:szCs w:val="20"/>
-        </w:rPr>
-        <w:tab/>
-      </w:r>
-      <w:r>
-        <w:rPr>
-          <w:rFonts w:ascii="Arial" w:cs="Arial" w:eastAsia="Arial" w:hAnsi="Arial"/>
-          <w:sz w:val="20"/>
-          <w:szCs w:val="20"/>
-        </w:rPr>
-        <w:t xml:space="preserve">10 (17 − 5 + 4 − 6)</w:t>
-      </w:r>
-    </w:p>
-    <w:p>
-      <w:pPr>
-        <w:keepLines/>
-        <w:spacing w:after="20" w:before="20" w:line="260" w:lineRule="auto"/>
-        <w:ind w:left="640" w:hanging="640"/>
-      </w:pPr>
-      <w:r>
-        <w:rPr>
-          <w:rFonts w:ascii="Arial" w:cs="Arial" w:eastAsia="Arial" w:hAnsi="Arial"/>
-          <w:b/>
-          <w:bCs/>
-          <w:sz w:val="20"/>
-          <w:szCs w:val="20"/>
-        </w:rPr>
-        <w:t xml:space="preserve">G2.</w:t>
-      </w:r>
-      <w:r>
-        <w:rPr>
-          <w:rFonts w:ascii="Arial" w:cs="Arial" w:eastAsia="Arial" w:hAnsi="Arial"/>
-          <w:sz w:val="20"/>
-          <w:szCs w:val="20"/>
-        </w:rPr>
-        <w:tab/>
-      </w:r>
-      <w:r>
-        <w:rPr>
-          <w:rFonts w:ascii="Arial" w:cs="Arial" w:eastAsia="Arial" w:hAnsi="Arial"/>
-          <w:sz w:val="20"/>
-          <w:szCs w:val="20"/>
-        </w:rPr>
-        <w:t xml:space="preserve">13 (the same as adding 7)</w:t>
-      </w:r>
-    </w:p>
-    <w:p>
-      <w:pPr>
-        <w:keepLines/>
-        <w:spacing w:after="20" w:before="20" w:line="260" w:lineRule="auto"/>
-        <w:ind w:left="640" w:hanging="640"/>
-      </w:pPr>
-      <w:r>
-        <w:rPr>
-          <w:rFonts w:ascii="Arial" w:cs="Arial" w:eastAsia="Arial" w:hAnsi="Arial"/>
-          <w:b/>
-          <w:bCs/>
-          <w:sz w:val="20"/>
-          <w:szCs w:val="20"/>
-        </w:rPr>
-        <w:t xml:space="preserve">G3.</w:t>
-      </w:r>
-      <w:r>
-        <w:rPr>
-          <w:rFonts w:ascii="Arial" w:cs="Arial" w:eastAsia="Arial" w:hAnsi="Arial"/>
-          <w:sz w:val="20"/>
-          <w:szCs w:val="20"/>
-        </w:rPr>
-        <w:tab/>
-      </w:r>
-      <w:r>
-        <w:rPr>
-          <w:rFonts w:ascii="Arial" w:cs="Arial" w:eastAsia="Arial" w:hAnsi="Arial"/>
-          <w:sz w:val="20"/>
-          <w:szCs w:val="20"/>
-        </w:rPr>
-        <w:t xml:space="preserve">11</w:t>
-      </w:r>
-    </w:p>
-    <w:p>
-      <w:pPr>
-        <w:keepLines/>
-        <w:spacing w:after="20" w:before="20" w:line="260" w:lineRule="auto"/>
-        <w:ind w:left="640" w:hanging="640"/>
-      </w:pPr>
-      <w:r>
-        <w:rPr>
-          <w:rFonts w:ascii="Arial" w:cs="Arial" w:eastAsia="Arial" w:hAnsi="Arial"/>
-          <w:b/>
-          <w:bCs/>
-          <w:sz w:val="20"/>
-          <w:szCs w:val="20"/>
-        </w:rPr>
-        <w:t xml:space="preserve">G4.</w:t>
-      </w:r>
-      <w:r>
-        <w:rPr>
-          <w:rFonts w:ascii="Arial" w:cs="Arial" w:eastAsia="Arial" w:hAnsi="Arial"/>
-          <w:sz w:val="20"/>
-          <w:szCs w:val="20"/>
-        </w:rPr>
-        <w:tab/>
-      </w:r>
-      <w:r>
-        <w:rPr>
-          <w:rFonts w:ascii="Arial" w:cs="Arial" w:eastAsia="Arial" w:hAnsi="Arial"/>
-          <w:sz w:val="20"/>
-          <w:szCs w:val="20"/>
-        </w:rPr>
-        <w:t xml:space="preserve">7</w:t>
-      </w:r>
-    </w:p>
-    <w:p>
-      <w:pPr>
-        <w:keepLines/>
-        <w:spacing w:after="20" w:before="20" w:line="260" w:lineRule="auto"/>
-        <w:ind w:left="640" w:hanging="640"/>
-      </w:pPr>
-      <w:r>
-        <w:rPr>
-          <w:rFonts w:ascii="Arial" w:cs="Arial" w:eastAsia="Arial" w:hAnsi="Arial"/>
-          <w:b/>
-          <w:bCs/>
-          <w:sz w:val="20"/>
-          <w:szCs w:val="20"/>
-        </w:rPr>
         <w:t xml:space="preserve">G5.</w:t>
       </w:r>
       <w:r>
@@ -14240,7 +14537,7 @@
           <w:sz w:val="20"/>
           <w:szCs w:val="20"/>
         </w:rPr>
-        <w:t xml:space="preserve">Ben 7 and Ali 12.</w:t>
+        <w:t xml:space="preserve">Ben 8 and Ali 12. (Take away the extra 4: 16 left, share: 8 and 8, give Ali the 4 back: 12.)</w:t>
       </w:r>
     </w:p>
     <w:p>
@@ -14587,6 +14884,138 @@
           <w:sz w:val="20"/>
           <w:szCs w:val="20"/>
         </w:rPr>
+        <w:t xml:space="preserve">$16. Count on from $34: $36, $40, $50. That is $2 + $4 + $10 = $16.</w:t>
+      </w:r>
+    </w:p>
+    <w:p>
+      <w:pPr>
+        <w:keepLines/>
+        <w:spacing w:after="20" w:before="20" w:line="260" w:lineRule="auto"/>
+        <w:ind w:left="640" w:hanging="640"/>
+      </w:pPr>
+      <w:r>
+        <w:rPr>
+          <w:rFonts w:ascii="Arial" w:cs="Arial" w:eastAsia="Arial" w:hAnsi="Arial"/>
+          <w:b/>
+          <w:bCs/>
+          <w:sz w:val="20"/>
+          <w:szCs w:val="20"/>
+        </w:rPr>
+        <w:t xml:space="preserve">S2.</w:t>
+      </w:r>
+      <w:r>
+        <w:rPr>
+          <w:rFonts w:ascii="Arial" w:cs="Arial" w:eastAsia="Arial" w:hAnsi="Arial"/>
+          <w:sz w:val="20"/>
+          <w:szCs w:val="20"/>
+        </w:rPr>
+        <w:tab/>
+      </w:r>
+      <w:r>
+        <w:rPr>
+          <w:rFonts w:ascii="Arial" w:cs="Arial" w:eastAsia="Arial" w:hAnsi="Arial"/>
+          <w:sz w:val="20"/>
+          <w:szCs w:val="20"/>
+        </w:rPr>
+        <w:t xml:space="preserve">2 sets: 50¢ + 10¢ + 5¢ + 5¢, and 20¢ + 20¢ + 20¢ + 10¢.</w:t>
+      </w:r>
+    </w:p>
+    <w:p>
+      <w:pPr>
+        <w:keepLines/>
+        <w:spacing w:after="20" w:before="20" w:line="260" w:lineRule="auto"/>
+        <w:ind w:left="640" w:hanging="640"/>
+      </w:pPr>
+      <w:r>
+        <w:rPr>
+          <w:rFonts w:ascii="Arial" w:cs="Arial" w:eastAsia="Arial" w:hAnsi="Arial"/>
+          <w:b/>
+          <w:bCs/>
+          <w:sz w:val="20"/>
+          <w:szCs w:val="20"/>
+        </w:rPr>
+        <w:t xml:space="preserve">S3.</w:t>
+      </w:r>
+      <w:r>
+        <w:rPr>
+          <w:rFonts w:ascii="Arial" w:cs="Arial" w:eastAsia="Arial" w:hAnsi="Arial"/>
+          <w:sz w:val="20"/>
+          <w:szCs w:val="20"/>
+        </w:rPr>
+        <w:tab/>
+      </w:r>
+      <w:r>
+        <w:rPr>
+          <w:rFonts w:ascii="Arial" w:cs="Arial" w:eastAsia="Arial" w:hAnsi="Arial"/>
+          <w:sz w:val="20"/>
+          <w:szCs w:val="20"/>
+        </w:rPr>
+        <w:t xml:space="preserve">Three 10¢ and three 20¢ (30 + 60 = 90).</w:t>
+      </w:r>
+    </w:p>
+    <w:p>
+      <w:pPr>
+        <w:keepLines/>
+        <w:spacing w:after="20" w:before="20" w:line="260" w:lineRule="auto"/>
+        <w:ind w:left="640" w:hanging="640"/>
+      </w:pPr>
+      <w:r>
+        <w:rPr>
+          <w:rFonts w:ascii="Arial" w:cs="Arial" w:eastAsia="Arial" w:hAnsi="Arial"/>
+          <w:b/>
+          <w:bCs/>
+          <w:sz w:val="20"/>
+          <w:szCs w:val="20"/>
+        </w:rPr>
+        <w:t xml:space="preserve">S4.</w:t>
+      </w:r>
+      <w:r>
+        <w:rPr>
+          <w:rFonts w:ascii="Arial" w:cs="Arial" w:eastAsia="Arial" w:hAnsi="Arial"/>
+          <w:sz w:val="20"/>
+          <w:szCs w:val="20"/>
+        </w:rPr>
+        <w:tab/>
+      </w:r>
+      <w:r>
+        <w:rPr>
+          <w:rFonts w:ascii="Arial" w:cs="Arial" w:eastAsia="Arial" w:hAnsi="Arial"/>
+          <w:sz w:val="20"/>
+          <w:szCs w:val="20"/>
+        </w:rPr>
+        <w:t xml:space="preserve">3 coins (20¢ + 20¢ + 5¢)</w:t>
+      </w:r>
+    </w:p>
+    <w:p>
+      <w:pPr>
+        <w:keepLines/>
+        <w:spacing w:after="20" w:before="20" w:line="260" w:lineRule="auto"/>
+        <w:ind w:left="640" w:hanging="640"/>
+      </w:pPr>
+      <w:r>
+        <w:rPr>
+          <w:rFonts w:ascii="Arial" w:cs="Arial" w:eastAsia="Arial" w:hAnsi="Arial"/>
+          <w:b/>
+          <w:bCs/>
+          <w:sz w:val="20"/>
+          <w:szCs w:val="20"/>
+        </w:rPr>
+        <w:t xml:space="preserve">S5.</w:t>
+      </w:r>
+      <w:r>
+        <w:rPr>
+          <w:rFonts w:ascii="Arial" w:cs="Arial" w:eastAsia="Arial" w:hAnsi="Arial"/>
+          <w:sz w:val="20"/>
+          <w:szCs w:val="20"/>
+        </w:rPr>
+        <w:tab/>
+      </w:r>
+      <w:r>
+        <w:rPr>
+          <w:rFonts w:ascii="Arial" w:cs="Arial" w:eastAsia="Arial" w:hAnsi="Arial"/>
+          <w:sz w:val="20"/>
+          <w:szCs w:val="20"/>
+        </w:rPr>
         <w:t xml:space="preserve">4 ways. (20+5; 10+10+5; 10+5+5+5; 5+5+5+5+5)</w:t>
       </w:r>
     </w:p>
@@ -14604,7 +15033,7 @@
           <w:sz w:val="20"/>
           <w:szCs w:val="20"/>
         </w:rPr>
-        <w:t xml:space="preserve">S2.</w:t>
+        <w:t xml:space="preserve">S6.</w:t>
       </w:r>
       <w:r>
         <w:rPr>
@@ -14637,7 +15066,7 @@
           <w:sz w:val="20"/>
           <w:szCs w:val="20"/>
         </w:rPr>
-        <w:t xml:space="preserve">S3.</w:t>
+        <w:t xml:space="preserve">S7.</w:t>
       </w:r>
       <w:r>
         <w:rPr>
@@ -14670,40 +15099,7 @@
           <w:sz w:val="20"/>
           <w:szCs w:val="20"/>
         </w:rPr>
-        <w:t xml:space="preserve">S4.</w:t>
-      </w:r>
-      <w:r>
-        <w:rPr>
-          <w:rFonts w:ascii="Arial" w:cs="Arial" w:eastAsia="Arial" w:hAnsi="Arial"/>
-          <w:sz w:val="20"/>
-          <w:szCs w:val="20"/>
-        </w:rPr>
-        <w:tab/>
-      </w:r>
-      <w:r>
-        <w:rPr>
-          <w:rFonts w:ascii="Arial" w:cs="Arial" w:eastAsia="Arial" w:hAnsi="Arial"/>
-          <w:sz w:val="20"/>
-          <w:szCs w:val="20"/>
-        </w:rPr>
-        <w:t xml:space="preserve">$16. Count on from $34: $36, $40, $50. That is $2 + $4 + $10 = $16.</w:t>
-      </w:r>
-    </w:p>
-    <w:p>
-      <w:pPr>
-        <w:keepLines/>
-        <w:spacing w:after="20" w:before="20" w:line="260" w:lineRule="auto"/>
-        <w:ind w:left="640" w:hanging="640"/>
-      </w:pPr>
-      <w:r>
-        <w:rPr>
-          <w:rFonts w:ascii="Arial" w:cs="Arial" w:eastAsia="Arial" w:hAnsi="Arial"/>
-          <w:b/>
-          <w:bCs/>
-          <w:sz w:val="20"/>
-          <w:szCs w:val="20"/>
-        </w:rPr>
-        <w:t xml:space="preserve">S5.</w:t>
+        <w:t xml:space="preserve">S8.</w:t>
       </w:r>
       <w:r>
         <w:rPr>
@@ -14736,40 +15132,7 @@
           <w:sz w:val="20"/>
           <w:szCs w:val="20"/>
         </w:rPr>
-        <w:t xml:space="preserve">S6.</w:t>
-      </w:r>
-      <w:r>
-        <w:rPr>
-          <w:rFonts w:ascii="Arial" w:cs="Arial" w:eastAsia="Arial" w:hAnsi="Arial"/>
-          <w:sz w:val="20"/>
-          <w:szCs w:val="20"/>
-        </w:rPr>
-        <w:tab/>
-      </w:r>
-      <w:r>
-        <w:rPr>
-          <w:rFonts w:ascii="Arial" w:cs="Arial" w:eastAsia="Arial" w:hAnsi="Arial"/>
-          <w:sz w:val="20"/>
-          <w:szCs w:val="20"/>
-        </w:rPr>
-        <w:t xml:space="preserve">3 coins (20¢ + 20¢ + 5¢)</w:t>
-      </w:r>
-    </w:p>
-    <w:p>
-      <w:pPr>
-        <w:keepLines/>
-        <w:spacing w:after="20" w:before="20" w:line="260" w:lineRule="auto"/>
-        <w:ind w:left="640" w:hanging="640"/>
-      </w:pPr>
-      <w:r>
-        <w:rPr>
-          <w:rFonts w:ascii="Arial" w:cs="Arial" w:eastAsia="Arial" w:hAnsi="Arial"/>
-          <w:b/>
-          <w:bCs/>
-          <w:sz w:val="20"/>
-          <w:szCs w:val="20"/>
-        </w:rPr>
-        <w:t xml:space="preserve">S7.</w:t>
+        <w:t xml:space="preserve">S9.</w:t>
       </w:r>
       <w:r>
         <w:rPr>
@@ -14917,7 +15280,7 @@
           <w:sz w:val="20"/>
           <w:szCs w:val="20"/>
         </w:rPr>
-        <w:t xml:space="preserve">Every amount that does not end in 0: 5, 15, 25, 35 and 45 cannot be made.</w:t>
+        <w:t xml:space="preserve">5¢, 15¢, 25¢, 35¢ and 45¢. (Every amount that does not end in 0.)</w:t>
       </w:r>
     </w:p>
     <w:p>
@@ -15165,7 +15528,7 @@
           <w:sz w:val="20"/>
           <w:szCs w:val="20"/>
         </w:rPr>
-        <w:t xml:space="preserve">5 sides and 5 corners</w:t>
+        <w:t xml:space="preserve">5 corners</w:t>
       </w:r>
     </w:p>
     <w:p>
@@ -15198,7 +15561,7 @@
           <w:sz w:val="20"/>
           <w:szCs w:val="20"/>
         </w:rPr>
-        <w:t xml:space="preserve">6 sides and 6 corners</w:t>
+        <w:t xml:space="preserve">6 corners</w:t>
       </w:r>
     </w:p>
     <w:p>
@@ -15231,7 +15594,7 @@
           <w:sz w:val="20"/>
           <w:szCs w:val="20"/>
         </w:rPr>
-        <w:t xml:space="preserve">8 sides and 8 corners</w:t>
+        <w:t xml:space="preserve">8 corners</w:t>
       </w:r>
     </w:p>
     <w:p>
@@ -15297,6 +15660,138 @@
           <w:sz w:val="20"/>
           <w:szCs w:val="20"/>
         </w:rPr>
+        <w:t xml:space="preserve">2 triangles of the same size</w:t>
+      </w:r>
+    </w:p>
+    <w:p>
+      <w:pPr>
+        <w:keepLines/>
+        <w:spacing w:after="20" w:before="20" w:line="260" w:lineRule="auto"/>
+        <w:ind w:left="640" w:hanging="640"/>
+      </w:pPr>
+      <w:r>
+        <w:rPr>
+          <w:rFonts w:ascii="Arial" w:cs="Arial" w:eastAsia="Arial" w:hAnsi="Arial"/>
+          <w:b/>
+          <w:bCs/>
+          <w:sz w:val="20"/>
+          <w:szCs w:val="20"/>
+        </w:rPr>
+        <w:t xml:space="preserve">S2.</w:t>
+      </w:r>
+      <w:r>
+        <w:rPr>
+          <w:rFonts w:ascii="Arial" w:cs="Arial" w:eastAsia="Arial" w:hAnsi="Arial"/>
+          <w:sz w:val="20"/>
+          <w:szCs w:val="20"/>
+        </w:rPr>
+        <w:tab/>
+      </w:r>
+      <w:r>
+        <w:rPr>
+          <w:rFonts w:ascii="Arial" w:cs="Arial" w:eastAsia="Arial" w:hAnsi="Arial"/>
+          <w:sz w:val="20"/>
+          <w:szCs w:val="20"/>
+        </w:rPr>
+        <w:t xml:space="preserve">Yes. Join them along a short side (the two equal short sides touching) to make one bigger triangle. Joining along the long side makes a square instead.</w:t>
+      </w:r>
+    </w:p>
+    <w:p>
+      <w:pPr>
+        <w:keepLines/>
+        <w:spacing w:after="20" w:before="20" w:line="260" w:lineRule="auto"/>
+        <w:ind w:left="640" w:hanging="640"/>
+      </w:pPr>
+      <w:r>
+        <w:rPr>
+          <w:rFonts w:ascii="Arial" w:cs="Arial" w:eastAsia="Arial" w:hAnsi="Arial"/>
+          <w:b/>
+          <w:bCs/>
+          <w:sz w:val="20"/>
+          <w:szCs w:val="20"/>
+        </w:rPr>
+        <w:t xml:space="preserve">S3.</w:t>
+      </w:r>
+      <w:r>
+        <w:rPr>
+          <w:rFonts w:ascii="Arial" w:cs="Arial" w:eastAsia="Arial" w:hAnsi="Arial"/>
+          <w:sz w:val="20"/>
+          <w:szCs w:val="20"/>
+        </w:rPr>
+        <w:tab/>
+      </w:r>
+      <w:r>
+        <w:rPr>
+          <w:rFonts w:ascii="Arial" w:cs="Arial" w:eastAsia="Arial" w:hAnsi="Arial"/>
+          <w:sz w:val="20"/>
+          <w:szCs w:val="20"/>
+        </w:rPr>
+        <w:t xml:space="preserve">8 (6 small squares + 2 squares made of 4 small ones)</w:t>
+      </w:r>
+    </w:p>
+    <w:p>
+      <w:pPr>
+        <w:keepLines/>
+        <w:spacing w:after="20" w:before="20" w:line="260" w:lineRule="auto"/>
+        <w:ind w:left="640" w:hanging="640"/>
+      </w:pPr>
+      <w:r>
+        <w:rPr>
+          <w:rFonts w:ascii="Arial" w:cs="Arial" w:eastAsia="Arial" w:hAnsi="Arial"/>
+          <w:b/>
+          <w:bCs/>
+          <w:sz w:val="20"/>
+          <w:szCs w:val="20"/>
+        </w:rPr>
+        <w:t xml:space="preserve">S4.</w:t>
+      </w:r>
+      <w:r>
+        <w:rPr>
+          <w:rFonts w:ascii="Arial" w:cs="Arial" w:eastAsia="Arial" w:hAnsi="Arial"/>
+          <w:sz w:val="20"/>
+          <w:szCs w:val="20"/>
+        </w:rPr>
+        <w:tab/>
+      </w:r>
+      <w:r>
+        <w:rPr>
+          <w:rFonts w:ascii="Arial" w:cs="Arial" w:eastAsia="Arial" w:hAnsi="Arial"/>
+          <w:sz w:val="20"/>
+          <w:szCs w:val="20"/>
+        </w:rPr>
+        <w:t xml:space="preserve">5 shapes: a line of 4, a 2 by 2 square, an L, a T and a zigzag.</w:t>
+      </w:r>
+    </w:p>
+    <w:p>
+      <w:pPr>
+        <w:keepLines/>
+        <w:spacing w:after="20" w:before="20" w:line="260" w:lineRule="auto"/>
+        <w:ind w:left="640" w:hanging="640"/>
+      </w:pPr>
+      <w:r>
+        <w:rPr>
+          <w:rFonts w:ascii="Arial" w:cs="Arial" w:eastAsia="Arial" w:hAnsi="Arial"/>
+          <w:b/>
+          <w:bCs/>
+          <w:sz w:val="20"/>
+          <w:szCs w:val="20"/>
+        </w:rPr>
+        <w:t xml:space="preserve">S5.</w:t>
+      </w:r>
+      <w:r>
+        <w:rPr>
+          <w:rFonts w:ascii="Arial" w:cs="Arial" w:eastAsia="Arial" w:hAnsi="Arial"/>
+          <w:sz w:val="20"/>
+          <w:szCs w:val="20"/>
+        </w:rPr>
+        <w:tab/>
+      </w:r>
+      <w:r>
+        <w:rPr>
+          <w:rFonts w:ascii="Arial" w:cs="Arial" w:eastAsia="Arial" w:hAnsi="Arial"/>
+          <w:sz w:val="20"/>
+          <w:szCs w:val="20"/>
+        </w:rPr>
         <w:t xml:space="preserve">A square</w:t>
       </w:r>
     </w:p>
@@ -15314,7 +15809,7 @@
           <w:sz w:val="20"/>
           <w:szCs w:val="20"/>
         </w:rPr>
-        <w:t xml:space="preserve">S2.</w:t>
+        <w:t xml:space="preserve">S6.</w:t>
       </w:r>
       <w:r>
         <w:rPr>
@@ -15347,7 +15842,7 @@
           <w:sz w:val="20"/>
           <w:szCs w:val="20"/>
         </w:rPr>
-        <w:t xml:space="preserve">S3.</w:t>
+        <w:t xml:space="preserve">S7.</w:t>
       </w:r>
       <w:r>
         <w:rPr>
@@ -15380,7 +15875,7 @@
           <w:sz w:val="20"/>
           <w:szCs w:val="20"/>
         </w:rPr>
-        <w:t xml:space="preserve">S4.</w:t>
+        <w:t xml:space="preserve">S8.</w:t>
       </w:r>
       <w:r>
         <w:rPr>
@@ -15413,89 +15908,23 @@
           <w:sz w:val="20"/>
           <w:szCs w:val="20"/>
         </w:rPr>
-        <w:t xml:space="preserve">S5.</w:t>
-      </w:r>
-      <w:r>
-        <w:rPr>
-          <w:rFonts w:ascii="Arial" w:cs="Arial" w:eastAsia="Arial" w:hAnsi="Arial"/>
-          <w:sz w:val="20"/>
-          <w:szCs w:val="20"/>
-        </w:rPr>
-        <w:tab/>
-      </w:r>
-      <w:r>
-        <w:rPr>
-          <w:rFonts w:ascii="Arial" w:cs="Arial" w:eastAsia="Arial" w:hAnsi="Arial"/>
-          <w:sz w:val="20"/>
-          <w:szCs w:val="20"/>
-        </w:rPr>
-        <w:t xml:space="preserve">2 triangles of the same size</w:t>
-      </w:r>
-    </w:p>
-    <w:p>
-      <w:pPr>
-        <w:keepLines/>
-        <w:spacing w:after="20" w:before="20" w:line="260" w:lineRule="auto"/>
-        <w:ind w:left="640" w:hanging="640"/>
-      </w:pPr>
-      <w:r>
-        <w:rPr>
-          <w:rFonts w:ascii="Arial" w:cs="Arial" w:eastAsia="Arial" w:hAnsi="Arial"/>
-          <w:b/>
-          <w:bCs/>
-          <w:sz w:val="20"/>
-          <w:szCs w:val="20"/>
-        </w:rPr>
-        <w:t xml:space="preserve">S6.</w:t>
-      </w:r>
-      <w:r>
-        <w:rPr>
-          <w:rFonts w:ascii="Arial" w:cs="Arial" w:eastAsia="Arial" w:hAnsi="Arial"/>
-          <w:sz w:val="20"/>
-          <w:szCs w:val="20"/>
-        </w:rPr>
-        <w:tab/>
-      </w:r>
-      <w:r>
-        <w:rPr>
-          <w:rFonts w:ascii="Arial" w:cs="Arial" w:eastAsia="Arial" w:hAnsi="Arial"/>
-          <w:sz w:val="20"/>
-          <w:szCs w:val="20"/>
-        </w:rPr>
-        <w:t xml:space="preserve">Yes. Join them along a short side (the two equal short sides touching) to make one bigger triangle. Joining along the long side makes a square instead.</w:t>
-      </w:r>
-    </w:p>
-    <w:p>
-      <w:pPr>
-        <w:keepLines/>
-        <w:spacing w:after="20" w:before="20" w:line="260" w:lineRule="auto"/>
-        <w:ind w:left="640" w:hanging="640"/>
-      </w:pPr>
-      <w:r>
-        <w:rPr>
-          <w:rFonts w:ascii="Arial" w:cs="Arial" w:eastAsia="Arial" w:hAnsi="Arial"/>
-          <w:b/>
-          <w:bCs/>
-          <w:sz w:val="20"/>
-          <w:szCs w:val="20"/>
-        </w:rPr>
-        <w:t xml:space="preserve">S7.</w:t>
-      </w:r>
-      <w:r>
-        <w:rPr>
-          <w:rFonts w:ascii="Arial" w:cs="Arial" w:eastAsia="Arial" w:hAnsi="Arial"/>
-          <w:sz w:val="20"/>
-          <w:szCs w:val="20"/>
-        </w:rPr>
-        <w:tab/>
-      </w:r>
-      <w:r>
-        <w:rPr>
-          <w:rFonts w:ascii="Arial" w:cs="Arial" w:eastAsia="Arial" w:hAnsi="Arial"/>
-          <w:sz w:val="20"/>
-          <w:szCs w:val="20"/>
-        </w:rPr>
-        <w:t xml:space="preserve">A parallelogram or a rhombus has 4 sides but its corners are not square.</w:t>
+        <w:t xml:space="preserve">S9.</w:t>
+      </w:r>
+      <w:r>
+        <w:rPr>
+          <w:rFonts w:ascii="Arial" w:cs="Arial" w:eastAsia="Arial" w:hAnsi="Arial"/>
+          <w:sz w:val="20"/>
+          <w:szCs w:val="20"/>
+        </w:rPr>
+        <w:tab/>
+      </w:r>
+      <w:r>
+        <w:rPr>
+          <w:rFonts w:ascii="Arial" w:cs="Arial" w:eastAsia="Arial" w:hAnsi="Arial"/>
+          <w:sz w:val="20"/>
+          <w:szCs w:val="20"/>
+        </w:rPr>
+        <w:t xml:space="preserve">Open. A long rectangle has 4 square corners, so it is a rectangle. A slanted shape with 4 sides does not have square corners, so it is not a rectangle.</w:t>
       </w:r>
     </w:p>
     <w:p>
@@ -16585,7 +17014,7 @@
           <w:sz w:val="20"/>
           <w:szCs w:val="20"/>
         </w:rPr>
-        <w:t xml:space="preserve">We cannot tell. The units are different sizes.</w:t>
+        <w:t xml:space="preserve">No. A cube and a paper clip are different lengths, so 8 of each are not the same.</w:t>
       </w:r>
     </w:p>
     <w:p>
@@ -16635,6 +17064,39 @@
           <w:sz w:val="20"/>
           <w:szCs w:val="20"/>
         </w:rPr>
+        <w:t xml:space="preserve">C6.</w:t>
+      </w:r>
+      <w:r>
+        <w:rPr>
+          <w:rFonts w:ascii="Arial" w:cs="Arial" w:eastAsia="Arial" w:hAnsi="Arial"/>
+          <w:sz w:val="20"/>
+          <w:szCs w:val="20"/>
+        </w:rPr>
+        <w:tab/>
+      </w:r>
+      <w:r>
+        <w:rPr>
+          <w:rFonts w:ascii="Arial" w:cs="Arial" w:eastAsia="Arial" w:hAnsi="Arial"/>
+          <w:sz w:val="20"/>
+          <w:szCs w:val="20"/>
+        </w:rPr>
+        <w:t xml:space="preserve">5 cm (count the spaces: 7 − 2)</w:t>
+      </w:r>
+    </w:p>
+    <w:p>
+      <w:pPr>
+        <w:keepLines/>
+        <w:spacing w:after="20" w:before="20" w:line="260" w:lineRule="auto"/>
+        <w:ind w:left="640" w:hanging="640"/>
+      </w:pPr>
+      <w:r>
+        <w:rPr>
+          <w:rFonts w:ascii="Arial" w:cs="Arial" w:eastAsia="Arial" w:hAnsi="Arial"/>
+          <w:b/>
+          <w:bCs/>
+          <w:sz w:val="20"/>
+          <w:szCs w:val="20"/>
+        </w:rPr>
         <w:t xml:space="preserve">S1.</w:t>
       </w:r>
       <w:r>
@@ -16651,6 +17113,138 @@
           <w:sz w:val="20"/>
           <w:szCs w:val="20"/>
         </w:rPr>
+        <w:t xml:space="preserve">15 cubes</w:t>
+      </w:r>
+    </w:p>
+    <w:p>
+      <w:pPr>
+        <w:keepLines/>
+        <w:spacing w:after="20" w:before="20" w:line="260" w:lineRule="auto"/>
+        <w:ind w:left="640" w:hanging="640"/>
+      </w:pPr>
+      <w:r>
+        <w:rPr>
+          <w:rFonts w:ascii="Arial" w:cs="Arial" w:eastAsia="Arial" w:hAnsi="Arial"/>
+          <w:b/>
+          <w:bCs/>
+          <w:sz w:val="20"/>
+          <w:szCs w:val="20"/>
+        </w:rPr>
+        <w:t xml:space="preserve">S2.</w:t>
+      </w:r>
+      <w:r>
+        <w:rPr>
+          <w:rFonts w:ascii="Arial" w:cs="Arial" w:eastAsia="Arial" w:hAnsi="Arial"/>
+          <w:sz w:val="20"/>
+          <w:szCs w:val="20"/>
+        </w:rPr>
+        <w:tab/>
+      </w:r>
+      <w:r>
+        <w:rPr>
+          <w:rFonts w:ascii="Arial" w:cs="Arial" w:eastAsia="Arial" w:hAnsi="Arial"/>
+          <w:sz w:val="20"/>
+          <w:szCs w:val="20"/>
+        </w:rPr>
+        <w:t xml:space="preserve">23 cubes</w:t>
+      </w:r>
+    </w:p>
+    <w:p>
+      <w:pPr>
+        <w:keepLines/>
+        <w:spacing w:after="20" w:before="20" w:line="260" w:lineRule="auto"/>
+        <w:ind w:left="640" w:hanging="640"/>
+      </w:pPr>
+      <w:r>
+        <w:rPr>
+          <w:rFonts w:ascii="Arial" w:cs="Arial" w:eastAsia="Arial" w:hAnsi="Arial"/>
+          <w:b/>
+          <w:bCs/>
+          <w:sz w:val="20"/>
+          <w:szCs w:val="20"/>
+        </w:rPr>
+        <w:t xml:space="preserve">S3.</w:t>
+      </w:r>
+      <w:r>
+        <w:rPr>
+          <w:rFonts w:ascii="Arial" w:cs="Arial" w:eastAsia="Arial" w:hAnsi="Arial"/>
+          <w:sz w:val="20"/>
+          <w:szCs w:val="20"/>
+        </w:rPr>
+        <w:tab/>
+      </w:r>
+      <w:r>
+        <w:rPr>
+          <w:rFonts w:ascii="Arial" w:cs="Arial" w:eastAsia="Arial" w:hAnsi="Arial"/>
+          <w:sz w:val="20"/>
+          <w:szCs w:val="20"/>
+        </w:rPr>
+        <w:t xml:space="preserve">8 cm (count the spaces from 3 to 11, or 11 − 3)</w:t>
+      </w:r>
+    </w:p>
+    <w:p>
+      <w:pPr>
+        <w:keepLines/>
+        <w:spacing w:after="20" w:before="20" w:line="260" w:lineRule="auto"/>
+        <w:ind w:left="640" w:hanging="640"/>
+      </w:pPr>
+      <w:r>
+        <w:rPr>
+          <w:rFonts w:ascii="Arial" w:cs="Arial" w:eastAsia="Arial" w:hAnsi="Arial"/>
+          <w:b/>
+          <w:bCs/>
+          <w:sz w:val="20"/>
+          <w:szCs w:val="20"/>
+        </w:rPr>
+        <w:t xml:space="preserve">S4.</w:t>
+      </w:r>
+      <w:r>
+        <w:rPr>
+          <w:rFonts w:ascii="Arial" w:cs="Arial" w:eastAsia="Arial" w:hAnsi="Arial"/>
+          <w:sz w:val="20"/>
+          <w:szCs w:val="20"/>
+        </w:rPr>
+        <w:tab/>
+      </w:r>
+      <w:r>
+        <w:rPr>
+          <w:rFonts w:ascii="Arial" w:cs="Arial" w:eastAsia="Arial" w:hAnsi="Arial"/>
+          <w:sz w:val="20"/>
+          <w:szCs w:val="20"/>
+        </w:rPr>
+        <w:t xml:space="preserve">24 erasers (a ruler is 3 + 3 = 6 erasers; a desk is 6 + 6 + 6 + 6 = 24)</w:t>
+      </w:r>
+    </w:p>
+    <w:p>
+      <w:pPr>
+        <w:keepLines/>
+        <w:spacing w:after="20" w:before="20" w:line="260" w:lineRule="auto"/>
+        <w:ind w:left="640" w:hanging="640"/>
+      </w:pPr>
+      <w:r>
+        <w:rPr>
+          <w:rFonts w:ascii="Arial" w:cs="Arial" w:eastAsia="Arial" w:hAnsi="Arial"/>
+          <w:b/>
+          <w:bCs/>
+          <w:sz w:val="20"/>
+          <w:szCs w:val="20"/>
+        </w:rPr>
+        <w:t xml:space="preserve">S5.</w:t>
+      </w:r>
+      <w:r>
+        <w:rPr>
+          <w:rFonts w:ascii="Arial" w:cs="Arial" w:eastAsia="Arial" w:hAnsi="Arial"/>
+          <w:sz w:val="20"/>
+          <w:szCs w:val="20"/>
+        </w:rPr>
+        <w:tab/>
+      </w:r>
+      <w:r>
+        <w:rPr>
+          <w:rFonts w:ascii="Arial" w:cs="Arial" w:eastAsia="Arial" w:hAnsi="Arial"/>
+          <w:sz w:val="20"/>
+          <w:szCs w:val="20"/>
+        </w:rPr>
         <w:t xml:space="preserve">4 clips</w:t>
       </w:r>
     </w:p>
@@ -16668,7 +17262,7 @@
           <w:sz w:val="20"/>
           <w:szCs w:val="20"/>
         </w:rPr>
-        <w:t xml:space="preserve">S2.</w:t>
+        <w:t xml:space="preserve">S6.</w:t>
       </w:r>
       <w:r>
         <w:rPr>
@@ -16701,7 +17295,7 @@
           <w:sz w:val="20"/>
           <w:szCs w:val="20"/>
         </w:rPr>
-        <w:t xml:space="preserve">S3.</w:t>
+        <w:t xml:space="preserve">S7.</w:t>
       </w:r>
       <w:r>
         <w:rPr>
@@ -16718,72 +17312,6 @@
           <w:szCs w:val="20"/>
         </w:rPr>
         <w:t xml:space="preserve">Ali’s. A bigger span needs fewer spans to cover the same desk.</w:t>
-      </w:r>
-    </w:p>
-    <w:p>
-      <w:pPr>
-        <w:keepLines/>
-        <w:spacing w:after="20" w:before="20" w:line="260" w:lineRule="auto"/>
-        <w:ind w:left="640" w:hanging="640"/>
-      </w:pPr>
-      <w:r>
-        <w:rPr>
-          <w:rFonts w:ascii="Arial" w:cs="Arial" w:eastAsia="Arial" w:hAnsi="Arial"/>
-          <w:b/>
-          <w:bCs/>
-          <w:sz w:val="20"/>
-          <w:szCs w:val="20"/>
-        </w:rPr>
-        <w:t xml:space="preserve">S4.</w:t>
-      </w:r>
-      <w:r>
-        <w:rPr>
-          <w:rFonts w:ascii="Arial" w:cs="Arial" w:eastAsia="Arial" w:hAnsi="Arial"/>
-          <w:sz w:val="20"/>
-          <w:szCs w:val="20"/>
-        </w:rPr>
-        <w:tab/>
-      </w:r>
-      <w:r>
-        <w:rPr>
-          <w:rFonts w:ascii="Arial" w:cs="Arial" w:eastAsia="Arial" w:hAnsi="Arial"/>
-          <w:sz w:val="20"/>
-          <w:szCs w:val="20"/>
-        </w:rPr>
-        <w:t xml:space="preserve">15 cubes</w:t>
-      </w:r>
-    </w:p>
-    <w:p>
-      <w:pPr>
-        <w:keepLines/>
-        <w:spacing w:after="20" w:before="20" w:line="260" w:lineRule="auto"/>
-        <w:ind w:left="640" w:hanging="640"/>
-      </w:pPr>
-      <w:r>
-        <w:rPr>
-          <w:rFonts w:ascii="Arial" w:cs="Arial" w:eastAsia="Arial" w:hAnsi="Arial"/>
-          <w:b/>
-          <w:bCs/>
-          <w:sz w:val="20"/>
-          <w:szCs w:val="20"/>
-        </w:rPr>
-        <w:t xml:space="preserve">S5.</w:t>
-      </w:r>
-      <w:r>
-        <w:rPr>
-          <w:rFonts w:ascii="Arial" w:cs="Arial" w:eastAsia="Arial" w:hAnsi="Arial"/>
-          <w:sz w:val="20"/>
-          <w:szCs w:val="20"/>
-        </w:rPr>
-        <w:tab/>
-      </w:r>
-      <w:r>
-        <w:rPr>
-          <w:rFonts w:ascii="Arial" w:cs="Arial" w:eastAsia="Arial" w:hAnsi="Arial"/>
-          <w:sz w:val="20"/>
-          <w:szCs w:val="20"/>
-        </w:rPr>
-        <w:t xml:space="preserve">23 cubes</w:t>
       </w:r>
     </w:p>
     <w:p>

</xml_diff>

<commit_message>
P3: reflection, warm-up check, fast track, open investigations; glyphs replaced with diagrams
Co-Authored-By: Claude Sonnet 5.5 <noreply@anthropic.com>
Claude-Session: https://claude.ai/code/session_01NYgB3ju57UwWRpkPPM6X7F
</commit_message>
<xml_diff>
--- a/outputs/designed/Math_Inquirers_P1_Question_Bank.docx
+++ b/outputs/designed/Math_Inquirers_P1_Question_Bank.docx
@@ -3095,7 +3095,7 @@
           <w:sz w:val="23"/>
           <w:szCs w:val="23"/>
         </w:rPr>
-        <w:t xml:space="preserve">□ + □ + 4 = 20, and both boxes are the same number. What is in the box?</w:t>
+        <w:t xml:space="preserve">A + A + 4 = 20, and the two As stand for the same number. What number is A?</w:t>
       </w:r>
     </w:p>
     <w:p>
@@ -4153,7 +4153,7 @@
           <w:sz w:val="23"/>
           <w:szCs w:val="23"/>
         </w:rPr>
-        <w:t xml:space="preserve">Key: ● = 2 children. Apple ●●●, Banana ●●●●●, Orange ●●. How many more chose banana than orange?</w:t>
+        <w:t xml:space="preserve">Each picture stands for 2 children. Apple has 3 pictures, banana has 5 and orange has 2. How many more children chose banana than orange?</w:t>
       </w:r>
     </w:p>
     <w:p>

</xml_diff>